<commit_message>
Complete Module 6: Angular SPA with full CRUD operations
</commit_message>
<xml_diff>
--- a/CS 465 Software Design Document JME.docx
+++ b/CS 465 Software Design Document JME.docx
@@ -237,6 +237,7 @@
           <w:docPartUnique/>
         </w:docPartObj>
       </w:sdtPr>
+      <w:sdtEndPr/>
       <w:sdtContent>
         <w:p>
           <w:pPr>
@@ -1699,6 +1700,129 @@
           </w:p>
         </w:tc>
       </w:tr>
+      <w:tr>
+        <w:tc>
+          <w:tcPr>
+            <w:tcW w:w="978" w:type="dxa"/>
+            <w:tcMar>
+              <w:top w:w="0" w:type="dxa"/>
+              <w:left w:w="115" w:type="dxa"/>
+              <w:bottom w:w="0" w:type="dxa"/>
+              <w:right w:w="115" w:type="dxa"/>
+            </w:tcMar>
+          </w:tcPr>
+          <w:p>
+            <w:pPr>
+              <w:suppressAutoHyphens/>
+              <w:contextualSpacing/>
+              <w:jc w:val="center"/>
+              <w:rPr>
+                <w:rFonts w:asciiTheme="majorHAnsi" w:hAnsiTheme="majorHAnsi" w:cstheme="majorHAnsi"/>
+                <w:sz w:val="22"/>
+                <w:szCs w:val="22"/>
+              </w:rPr>
+            </w:pPr>
+            <w:r>
+              <w:rPr>
+                <w:rFonts w:asciiTheme="majorHAnsi" w:hAnsiTheme="majorHAnsi" w:cstheme="majorHAnsi"/>
+                <w:sz w:val="22"/>
+                <w:szCs w:val="22"/>
+              </w:rPr>
+              <w:t>2.0</w:t>
+            </w:r>
+          </w:p>
+        </w:tc>
+        <w:tc>
+          <w:tcPr>
+            <w:tcW w:w="1530" w:type="dxa"/>
+            <w:tcMar>
+              <w:top w:w="0" w:type="dxa"/>
+              <w:left w:w="115" w:type="dxa"/>
+              <w:bottom w:w="0" w:type="dxa"/>
+              <w:right w:w="115" w:type="dxa"/>
+            </w:tcMar>
+          </w:tcPr>
+          <w:p>
+            <w:pPr>
+              <w:suppressAutoHyphens/>
+              <w:contextualSpacing/>
+              <w:rPr>
+                <w:rFonts w:asciiTheme="majorHAnsi" w:hAnsiTheme="majorHAnsi" w:cstheme="majorHAnsi"/>
+                <w:sz w:val="22"/>
+                <w:szCs w:val="22"/>
+              </w:rPr>
+            </w:pPr>
+            <w:r>
+              <w:rPr>
+                <w:rFonts w:asciiTheme="majorHAnsi" w:hAnsiTheme="majorHAnsi" w:cstheme="majorHAnsi"/>
+                <w:sz w:val="22"/>
+                <w:szCs w:val="22"/>
+              </w:rPr>
+              <w:t>02/15/2026</w:t>
+            </w:r>
+          </w:p>
+        </w:tc>
+        <w:tc>
+          <w:tcPr>
+            <w:tcW w:w="1725" w:type="dxa"/>
+            <w:tcMar>
+              <w:top w:w="0" w:type="dxa"/>
+              <w:left w:w="115" w:type="dxa"/>
+              <w:bottom w:w="0" w:type="dxa"/>
+              <w:right w:w="115" w:type="dxa"/>
+            </w:tcMar>
+          </w:tcPr>
+          <w:p>
+            <w:pPr>
+              <w:suppressAutoHyphens/>
+              <w:contextualSpacing/>
+              <w:rPr>
+                <w:rFonts w:asciiTheme="majorHAnsi" w:hAnsiTheme="majorHAnsi" w:cstheme="majorHAnsi"/>
+                <w:sz w:val="22"/>
+                <w:szCs w:val="22"/>
+              </w:rPr>
+            </w:pPr>
+            <w:r>
+              <w:rPr>
+                <w:rFonts w:asciiTheme="majorHAnsi" w:hAnsiTheme="majorHAnsi" w:cstheme="majorHAnsi"/>
+                <w:sz w:val="22"/>
+                <w:szCs w:val="22"/>
+              </w:rPr>
+              <w:t>Jose Morales Egipciaco</w:t>
+            </w:r>
+          </w:p>
+        </w:tc>
+        <w:tc>
+          <w:tcPr>
+            <w:tcW w:w="5109" w:type="dxa"/>
+            <w:tcMar>
+              <w:top w:w="0" w:type="dxa"/>
+              <w:left w:w="115" w:type="dxa"/>
+              <w:bottom w:w="0" w:type="dxa"/>
+              <w:right w:w="115" w:type="dxa"/>
+            </w:tcMar>
+          </w:tcPr>
+          <w:p>
+            <w:pPr>
+              <w:suppressAutoHyphens/>
+              <w:contextualSpacing/>
+              <w:rPr>
+                <w:rFonts w:asciiTheme="majorHAnsi" w:hAnsiTheme="majorHAnsi" w:cstheme="majorHAnsi"/>
+                <w:sz w:val="22"/>
+                <w:szCs w:val="22"/>
+              </w:rPr>
+            </w:pPr>
+            <w:r>
+              <w:rPr>
+                <w:rFonts w:asciiTheme="majorHAnsi" w:hAnsiTheme="majorHAnsi" w:cstheme="majorHAnsi"/>
+                <w:sz w:val="22"/>
+                <w:szCs w:val="22"/>
+              </w:rPr>
+              <w:t>Milestone Two – Add Sequence and Class Diagram</w:t>
+            </w:r>
+          </w:p>
+        </w:tc>
+      </w:tr>
     </w:tbl>
     <w:p>
       <w:pPr>
@@ -2120,6 +2244,83 @@
     </w:p>
     <w:p>
       <w:pPr>
+        <w:suppressAutoHyphens/>
+        <w:contextualSpacing/>
+        <w:rPr>
+          <w:rFonts w:asciiTheme="majorHAnsi" w:hAnsiTheme="majorHAnsi" w:cstheme="majorHAnsi"/>
+          <w:sz w:val="22"/>
+          <w:szCs w:val="22"/>
+        </w:rPr>
+      </w:pPr>
+    </w:p>
+    <w:p>
+      <w:pPr>
+        <w:suppressAutoHyphens/>
+        <w:contextualSpacing/>
+        <w:rPr>
+          <w:rFonts w:asciiTheme="majorHAnsi" w:hAnsiTheme="majorHAnsi" w:cstheme="majorHAnsi"/>
+          <w:sz w:val="22"/>
+          <w:szCs w:val="22"/>
+        </w:rPr>
+      </w:pPr>
+    </w:p>
+    <w:p>
+      <w:pPr>
+        <w:suppressAutoHyphens/>
+        <w:contextualSpacing/>
+        <w:rPr>
+          <w:rFonts w:asciiTheme="majorHAnsi" w:hAnsiTheme="majorHAnsi" w:cstheme="majorHAnsi"/>
+          <w:sz w:val="22"/>
+          <w:szCs w:val="22"/>
+        </w:rPr>
+      </w:pPr>
+    </w:p>
+    <w:p>
+      <w:pPr>
+        <w:suppressAutoHyphens/>
+        <w:contextualSpacing/>
+        <w:rPr>
+          <w:rFonts w:asciiTheme="majorHAnsi" w:hAnsiTheme="majorHAnsi" w:cstheme="majorHAnsi"/>
+          <w:sz w:val="22"/>
+          <w:szCs w:val="22"/>
+        </w:rPr>
+      </w:pPr>
+    </w:p>
+    <w:p>
+      <w:pPr>
+        <w:suppressAutoHyphens/>
+        <w:contextualSpacing/>
+        <w:rPr>
+          <w:rFonts w:asciiTheme="majorHAnsi" w:hAnsiTheme="majorHAnsi" w:cstheme="majorHAnsi"/>
+          <w:sz w:val="22"/>
+          <w:szCs w:val="22"/>
+        </w:rPr>
+      </w:pPr>
+    </w:p>
+    <w:p>
+      <w:pPr>
+        <w:suppressAutoHyphens/>
+        <w:contextualSpacing/>
+        <w:rPr>
+          <w:rFonts w:asciiTheme="majorHAnsi" w:hAnsiTheme="majorHAnsi" w:cstheme="majorHAnsi"/>
+          <w:sz w:val="22"/>
+          <w:szCs w:val="22"/>
+        </w:rPr>
+      </w:pPr>
+    </w:p>
+    <w:p>
+      <w:pPr>
+        <w:suppressAutoHyphens/>
+        <w:contextualSpacing/>
+        <w:rPr>
+          <w:rFonts w:asciiTheme="majorHAnsi" w:hAnsiTheme="majorHAnsi" w:cstheme="majorHAnsi"/>
+          <w:sz w:val="22"/>
+          <w:szCs w:val="22"/>
+        </w:rPr>
+      </w:pPr>
+    </w:p>
+    <w:p>
+      <w:pPr>
         <w:pStyle w:val="Heading3"/>
         <w:suppressAutoHyphens/>
         <w:contextualSpacing/>
@@ -2132,6 +2333,7 @@
         <w:rPr>
           <w:rFonts w:asciiTheme="majorHAnsi" w:hAnsiTheme="majorHAnsi" w:cstheme="majorHAnsi"/>
         </w:rPr>
+        <w:lastRenderedPageBreak/>
         <w:t>Component Diagram</w:t>
       </w:r>
       <w:bookmarkEnd w:id="8"/>
@@ -2164,9 +2366,8 @@
           <w:sz w:val="22"/>
           <w:szCs w:val="22"/>
         </w:rPr>
-        <w:lastRenderedPageBreak/>
         <w:drawing>
-          <wp:inline distT="0" distB="0" distL="0" distR="0" wp14:anchorId="319AC12D" wp14:editId="0B4C6135">
+          <wp:inline distT="0" distB="0" distL="0" distR="0" wp14:anchorId="319AC12D" wp14:editId="12849DCD">
             <wp:extent cx="5513696" cy="4147053"/>
             <wp:effectExtent l="0" t="0" r="0" b="6350"/>
             <wp:docPr id="1" name="Picture 1" descr="Please see the hyperlinked Word Document &quot;CS 465 Full Stack Component Diagram Text Version&quot; for alternative text. "/>
@@ -2346,6 +2547,61 @@
     </w:p>
     <w:p>
       <w:pPr>
+        <w:suppressAutoHyphens/>
+        <w:contextualSpacing/>
+        <w:rPr>
+          <w:rFonts w:asciiTheme="majorHAnsi" w:hAnsiTheme="majorHAnsi" w:cstheme="majorHAnsi"/>
+          <w:sz w:val="22"/>
+          <w:szCs w:val="22"/>
+        </w:rPr>
+      </w:pPr>
+    </w:p>
+    <w:p>
+      <w:pPr>
+        <w:suppressAutoHyphens/>
+        <w:contextualSpacing/>
+        <w:rPr>
+          <w:rFonts w:asciiTheme="majorHAnsi" w:hAnsiTheme="majorHAnsi" w:cstheme="majorHAnsi"/>
+          <w:sz w:val="22"/>
+          <w:szCs w:val="22"/>
+        </w:rPr>
+      </w:pPr>
+    </w:p>
+    <w:p>
+      <w:pPr>
+        <w:suppressAutoHyphens/>
+        <w:contextualSpacing/>
+        <w:rPr>
+          <w:rFonts w:asciiTheme="majorHAnsi" w:hAnsiTheme="majorHAnsi" w:cstheme="majorHAnsi"/>
+          <w:sz w:val="22"/>
+          <w:szCs w:val="22"/>
+        </w:rPr>
+      </w:pPr>
+    </w:p>
+    <w:p>
+      <w:pPr>
+        <w:suppressAutoHyphens/>
+        <w:contextualSpacing/>
+        <w:rPr>
+          <w:rFonts w:asciiTheme="majorHAnsi" w:hAnsiTheme="majorHAnsi" w:cstheme="majorHAnsi"/>
+          <w:sz w:val="22"/>
+          <w:szCs w:val="22"/>
+        </w:rPr>
+      </w:pPr>
+    </w:p>
+    <w:p>
+      <w:pPr>
+        <w:suppressAutoHyphens/>
+        <w:contextualSpacing/>
+        <w:rPr>
+          <w:rFonts w:asciiTheme="majorHAnsi" w:hAnsiTheme="majorHAnsi" w:cstheme="majorHAnsi"/>
+          <w:sz w:val="22"/>
+          <w:szCs w:val="22"/>
+        </w:rPr>
+      </w:pPr>
+    </w:p>
+    <w:p>
+      <w:pPr>
         <w:pStyle w:val="Heading3"/>
         <w:suppressAutoHyphens/>
         <w:contextualSpacing/>
@@ -2390,71 +2646,131 @@
           <w:rFonts w:asciiTheme="majorHAnsi" w:hAnsiTheme="majorHAnsi" w:cstheme="majorHAnsi"/>
           <w:b/>
           <w:bCs/>
-          <w:i/>
-          <w:iCs/>
-          <w:sz w:val="22"/>
-          <w:szCs w:val="22"/>
-        </w:rPr>
-        <w:t>*</w:t>
-      </w:r>
-      <w:r>
-        <w:rPr>
-          <w:rFonts w:asciiTheme="majorHAnsi" w:hAnsiTheme="majorHAnsi" w:cstheme="majorHAnsi"/>
-          <w:b/>
-          <w:bCs/>
-          <w:i/>
-          <w:iCs/>
-          <w:sz w:val="22"/>
-          <w:szCs w:val="22"/>
-        </w:rPr>
-        <w:t>Sequence diagram image</w:t>
-      </w:r>
-      <w:r>
-        <w:rPr>
-          <w:rFonts w:asciiTheme="majorHAnsi" w:hAnsiTheme="majorHAnsi" w:cstheme="majorHAnsi"/>
-          <w:b/>
-          <w:bCs/>
-          <w:i/>
-          <w:iCs/>
-          <w:sz w:val="22"/>
-          <w:szCs w:val="22"/>
-        </w:rPr>
-        <w:t>*</w:t>
-      </w:r>
-      <w:r>
-        <w:rPr>
-          <w:rFonts w:asciiTheme="majorHAnsi" w:hAnsiTheme="majorHAnsi" w:cstheme="majorHAnsi"/>
-          <w:b/>
-          <w:bCs/>
-          <w:i/>
-          <w:iCs/>
-          <w:sz w:val="22"/>
-          <w:szCs w:val="22"/>
-        </w:rPr>
-        <w:t xml:space="preserve"> to be inserted in the next milestone as Angular SPA development progresses.</w:t>
-      </w:r>
-    </w:p>
-    <w:p>
-      <w:pPr>
-        <w:suppressAutoHyphens/>
-        <w:contextualSpacing/>
-        <w:rPr>
-          <w:rFonts w:asciiTheme="majorHAnsi" w:hAnsiTheme="majorHAnsi" w:cstheme="majorHAnsi"/>
-          <w:sz w:val="22"/>
-          <w:szCs w:val="22"/>
-        </w:rPr>
-      </w:pPr>
-    </w:p>
-    <w:p>
-      <w:pPr>
-        <w:suppressAutoHyphens/>
-        <w:contextualSpacing/>
-        <w:rPr>
-          <w:rFonts w:asciiTheme="majorHAnsi" w:hAnsiTheme="majorHAnsi" w:cstheme="majorHAnsi"/>
-          <w:sz w:val="22"/>
-          <w:szCs w:val="22"/>
-        </w:rPr>
-      </w:pPr>
+          <w:noProof/>
+          <w:sz w:val="22"/>
+          <w:szCs w:val="22"/>
+        </w:rPr>
+        <w:drawing>
+          <wp:inline distT="0" distB="0" distL="0" distR="0" wp14:anchorId="287F65ED" wp14:editId="31D9FB26">
+            <wp:extent cx="5943600" cy="4592955"/>
+            <wp:effectExtent l="0" t="0" r="0" b="0"/>
+            <wp:docPr id="1090361212" name="Picture 1"/>
+            <wp:cNvGraphicFramePr>
+              <a:graphicFrameLocks xmlns:a="http://schemas.openxmlformats.org/drawingml/2006/main" noChangeAspect="1"/>
+            </wp:cNvGraphicFramePr>
+            <a:graphic xmlns:a="http://schemas.openxmlformats.org/drawingml/2006/main">
+              <a:graphicData uri="http://schemas.openxmlformats.org/drawingml/2006/picture">
+                <pic:pic xmlns:pic="http://schemas.openxmlformats.org/drawingml/2006/picture">
+                  <pic:nvPicPr>
+                    <pic:cNvPr id="1090361212" name="Picture 1090361212"/>
+                    <pic:cNvPicPr/>
+                  </pic:nvPicPr>
+                  <pic:blipFill>
+                    <a:blip r:embed="rId14" cstate="print">
+                      <a:extLst>
+                        <a:ext uri="{28A0092B-C50C-407E-A947-70E740481C1C}">
+                          <a14:useLocalDpi xmlns:a14="http://schemas.microsoft.com/office/drawing/2010/main" val="0"/>
+                        </a:ext>
+                      </a:extLst>
+                    </a:blip>
+                    <a:stretch>
+                      <a:fillRect/>
+                    </a:stretch>
+                  </pic:blipFill>
+                  <pic:spPr>
+                    <a:xfrm>
+                      <a:off x="0" y="0"/>
+                      <a:ext cx="5943600" cy="4592955"/>
+                    </a:xfrm>
+                    <a:prstGeom prst="rect">
+                      <a:avLst/>
+                    </a:prstGeom>
+                  </pic:spPr>
+                </pic:pic>
+              </a:graphicData>
+            </a:graphic>
+          </wp:inline>
+        </w:drawing>
+      </w:r>
+    </w:p>
+    <w:p>
+      <w:pPr>
+        <w:suppressAutoHyphens/>
+        <w:contextualSpacing/>
+        <w:rPr>
+          <w:rFonts w:asciiTheme="majorHAnsi" w:hAnsiTheme="majorHAnsi" w:cstheme="majorHAnsi"/>
+          <w:sz w:val="22"/>
+          <w:szCs w:val="22"/>
+        </w:rPr>
+      </w:pPr>
+    </w:p>
+    <w:p>
+      <w:pPr>
+        <w:suppressAutoHyphens/>
+        <w:contextualSpacing/>
+        <w:rPr>
+          <w:rFonts w:asciiTheme="majorHAnsi" w:hAnsiTheme="majorHAnsi" w:cstheme="majorHAnsi"/>
+          <w:sz w:val="22"/>
+          <w:szCs w:val="22"/>
+        </w:rPr>
+      </w:pPr>
+      <w:r>
+        <w:rPr>
+          <w:rFonts w:asciiTheme="majorHAnsi" w:hAnsiTheme="majorHAnsi" w:cstheme="majorHAnsi"/>
+          <w:sz w:val="22"/>
+          <w:szCs w:val="22"/>
+        </w:rPr>
+        <w:t>The application flow follows a three-tier interaction pattern. For the customer-facing trips display, the browser sends an HTTP GET request to the Express server at the /travel endpoint. The Express router directs this to the Travlr controller, which queries MongoDB through Mongoose to retrieve trip documents. The database returns the trip data, which the controller passes to the Handlebars view engine for server-side rendering. The rendered HTML is sent back to the browser for display.</w:t>
+      </w:r>
+    </w:p>
+    <w:p>
+      <w:pPr>
+        <w:suppressAutoHyphens/>
+        <w:contextualSpacing/>
+        <w:rPr>
+          <w:rFonts w:asciiTheme="majorHAnsi" w:hAnsiTheme="majorHAnsi" w:cstheme="majorHAnsi"/>
+          <w:sz w:val="22"/>
+          <w:szCs w:val="22"/>
+        </w:rPr>
+      </w:pPr>
+      <w:r>
+        <w:rPr>
+          <w:rFonts w:asciiTheme="majorHAnsi" w:hAnsiTheme="majorHAnsi" w:cstheme="majorHAnsi"/>
+          <w:sz w:val="22"/>
+          <w:szCs w:val="22"/>
+        </w:rPr>
+        <w:t>For admin authentication, the Angular SPA sends credentials via an HTTP POST request to the /api/login endpoint. Express validates these credentials against stored user data in MongoDB. If valid, the server generates a JSON Web Token (JWT) and returns it to the Angular app, which stores it for subsequent authenticated requests.</w:t>
+      </w:r>
+    </w:p>
+    <w:p>
+      <w:pPr>
+        <w:suppressAutoHyphens/>
+        <w:contextualSpacing/>
+        <w:rPr>
+          <w:rFonts w:asciiTheme="majorHAnsi" w:hAnsiTheme="majorHAnsi" w:cstheme="majorHAnsi"/>
+          <w:sz w:val="22"/>
+          <w:szCs w:val="22"/>
+        </w:rPr>
+      </w:pPr>
+    </w:p>
+    <w:p>
+      <w:pPr>
+        <w:suppressAutoHyphens/>
+        <w:contextualSpacing/>
+        <w:rPr>
+          <w:rFonts w:asciiTheme="majorHAnsi" w:hAnsiTheme="majorHAnsi" w:cstheme="majorHAnsi"/>
+          <w:sz w:val="22"/>
+          <w:szCs w:val="22"/>
+        </w:rPr>
+      </w:pPr>
+      <w:r>
+        <w:rPr>
+          <w:rFonts w:asciiTheme="majorHAnsi" w:hAnsiTheme="majorHAnsi" w:cstheme="majorHAnsi"/>
+          <w:sz w:val="22"/>
+          <w:szCs w:val="22"/>
+        </w:rPr>
+        <w:t xml:space="preserve">Admin CRUD operations follow a similar pattern with added authentication. When an administrator updates a trip, the Angular app sends a PUT request to /api/trips/:tripId with the JWT in the request header. Express middleware validates the token, then the trip controller processes the update request. Mongoose updates the specified document in MongoDB, and the database confirms the operation. The success response flows back through Express to the Angular app, which updates its local state and </w:t>
+      </w:r>
       <w:r>
         <w:rPr>
           <w:rFonts w:asciiTheme="majorHAnsi" w:hAnsiTheme="majorHAnsi" w:cstheme="majorHAnsi"/>
@@ -2462,56 +2778,7 @@
           <w:szCs w:val="22"/>
         </w:rPr>
         <w:lastRenderedPageBreak/>
-        <w:t>The application flow follows a three-tier interaction pattern. For the customer-facing trips display, the browser sends an HTTP GET request to the Express server at the /travel endpoint. The Express router directs this to the Travlr controller, which queries MongoDB through Mongoose to retrieve trip documents. The database returns the trip data, which the controller passes to the Handlebars view engine for server-side rendering. The rendered HTML is sent back to the browser for display.</w:t>
-      </w:r>
-    </w:p>
-    <w:p>
-      <w:pPr>
-        <w:suppressAutoHyphens/>
-        <w:contextualSpacing/>
-        <w:rPr>
-          <w:rFonts w:asciiTheme="majorHAnsi" w:hAnsiTheme="majorHAnsi" w:cstheme="majorHAnsi"/>
-          <w:sz w:val="22"/>
-          <w:szCs w:val="22"/>
-        </w:rPr>
-      </w:pPr>
-      <w:r>
-        <w:rPr>
-          <w:rFonts w:asciiTheme="majorHAnsi" w:hAnsiTheme="majorHAnsi" w:cstheme="majorHAnsi"/>
-          <w:sz w:val="22"/>
-          <w:szCs w:val="22"/>
-        </w:rPr>
-        <w:t>For admin authentication, the Angular SPA sends credentials via an HTTP POST request to the /api/login endpoint. Express validates these credentials against stored user data in MongoDB. If valid, the server generates a JSON Web Token (JWT) and returns it to the Angular app, which stores it for subsequent authenticated requests.</w:t>
-      </w:r>
-    </w:p>
-    <w:p>
-      <w:pPr>
-        <w:suppressAutoHyphens/>
-        <w:contextualSpacing/>
-        <w:rPr>
-          <w:rFonts w:asciiTheme="majorHAnsi" w:hAnsiTheme="majorHAnsi" w:cstheme="majorHAnsi"/>
-          <w:sz w:val="22"/>
-          <w:szCs w:val="22"/>
-        </w:rPr>
-      </w:pPr>
-    </w:p>
-    <w:p>
-      <w:pPr>
-        <w:suppressAutoHyphens/>
-        <w:contextualSpacing/>
-        <w:rPr>
-          <w:rFonts w:asciiTheme="majorHAnsi" w:hAnsiTheme="majorHAnsi" w:cstheme="majorHAnsi"/>
-          <w:sz w:val="22"/>
-          <w:szCs w:val="22"/>
-        </w:rPr>
-      </w:pPr>
-      <w:r>
-        <w:rPr>
-          <w:rFonts w:asciiTheme="majorHAnsi" w:hAnsiTheme="majorHAnsi" w:cstheme="majorHAnsi"/>
-          <w:sz w:val="22"/>
-          <w:szCs w:val="22"/>
-        </w:rPr>
-        <w:t>Admin CRUD operations follow a similar pattern with added authentication. When an administrator updates a trip, the Angular app sends a PUT request to /api/trips/:tripId with the JWT in the request header. Express middleware validates the token, then the trip controller processes the update request. Mongoose updates the specified document in MongoDB, and the database confirms the operation. The success response flows back through Express to the Angular app, which updates its local state and refreshes the UI. This separation of concerns across tiers ensures security, maintainability, and scalability of the application.</w:t>
+        <w:t>refreshes the UI. This separation of concerns across tiers ensures security, maintainability, and scalability of the application.</w:t>
       </w:r>
     </w:p>
     <w:p>
@@ -2575,72 +2842,51 @@
           <w:rFonts w:asciiTheme="majorHAnsi" w:hAnsiTheme="majorHAnsi" w:cstheme="majorHAnsi"/>
           <w:b/>
           <w:bCs/>
-          <w:i/>
-          <w:iCs/>
-          <w:sz w:val="22"/>
-          <w:szCs w:val="22"/>
-        </w:rPr>
-        <w:t>*</w:t>
-      </w:r>
-      <w:r>
-        <w:rPr>
-          <w:rFonts w:asciiTheme="majorHAnsi" w:hAnsiTheme="majorHAnsi" w:cstheme="majorHAnsi"/>
-          <w:b/>
-          <w:bCs/>
-          <w:i/>
-          <w:iCs/>
-          <w:sz w:val="22"/>
-          <w:szCs w:val="22"/>
-        </w:rPr>
-        <w:t>Class diagram image</w:t>
-      </w:r>
-      <w:r>
-        <w:rPr>
-          <w:rFonts w:asciiTheme="majorHAnsi" w:hAnsiTheme="majorHAnsi" w:cstheme="majorHAnsi"/>
-          <w:b/>
-          <w:bCs/>
-          <w:i/>
-          <w:iCs/>
-          <w:sz w:val="22"/>
-          <w:szCs w:val="22"/>
-        </w:rPr>
-        <w:t>*</w:t>
-      </w:r>
-      <w:r>
-        <w:rPr>
-          <w:rFonts w:asciiTheme="majorHAnsi" w:hAnsiTheme="majorHAnsi" w:cstheme="majorHAnsi"/>
-          <w:b/>
-          <w:bCs/>
-          <w:i/>
-          <w:iCs/>
-          <w:sz w:val="22"/>
-          <w:szCs w:val="22"/>
-        </w:rPr>
-        <w:t xml:space="preserve"> </w:t>
-      </w:r>
-      <w:r>
-        <w:rPr>
-          <w:rFonts w:asciiTheme="majorHAnsi" w:hAnsiTheme="majorHAnsi" w:cstheme="majorHAnsi"/>
-          <w:b/>
-          <w:bCs/>
-          <w:i/>
-          <w:iCs/>
-          <w:sz w:val="22"/>
-          <w:szCs w:val="22"/>
-        </w:rPr>
-        <w:t>to</w:t>
-      </w:r>
-      <w:r>
-        <w:rPr>
-          <w:rFonts w:asciiTheme="majorHAnsi" w:hAnsiTheme="majorHAnsi" w:cstheme="majorHAnsi"/>
-          <w:b/>
-          <w:bCs/>
-          <w:i/>
-          <w:iCs/>
-          <w:sz w:val="22"/>
-          <w:szCs w:val="22"/>
-        </w:rPr>
-        <w:t xml:space="preserve"> be inserted in the next milestone as application classes are finalized.</w:t>
+          <w:noProof/>
+          <w:sz w:val="22"/>
+          <w:szCs w:val="22"/>
+        </w:rPr>
+        <w:drawing>
+          <wp:inline distT="0" distB="0" distL="0" distR="0" wp14:anchorId="6ADB58FB" wp14:editId="42F1029E">
+            <wp:extent cx="5943600" cy="4592955"/>
+            <wp:effectExtent l="0" t="0" r="0" b="0"/>
+            <wp:docPr id="567551541" name="Picture 2"/>
+            <wp:cNvGraphicFramePr>
+              <a:graphicFrameLocks xmlns:a="http://schemas.openxmlformats.org/drawingml/2006/main" noChangeAspect="1"/>
+            </wp:cNvGraphicFramePr>
+            <a:graphic xmlns:a="http://schemas.openxmlformats.org/drawingml/2006/main">
+              <a:graphicData uri="http://schemas.openxmlformats.org/drawingml/2006/picture">
+                <pic:pic xmlns:pic="http://schemas.openxmlformats.org/drawingml/2006/picture">
+                  <pic:nvPicPr>
+                    <pic:cNvPr id="567551541" name="Picture 567551541"/>
+                    <pic:cNvPicPr/>
+                  </pic:nvPicPr>
+                  <pic:blipFill>
+                    <a:blip r:embed="rId15" cstate="print">
+                      <a:extLst>
+                        <a:ext uri="{28A0092B-C50C-407E-A947-70E740481C1C}">
+                          <a14:useLocalDpi xmlns:a14="http://schemas.microsoft.com/office/drawing/2010/main" val="0"/>
+                        </a:ext>
+                      </a:extLst>
+                    </a:blip>
+                    <a:stretch>
+                      <a:fillRect/>
+                    </a:stretch>
+                  </pic:blipFill>
+                  <pic:spPr>
+                    <a:xfrm>
+                      <a:off x="0" y="0"/>
+                      <a:ext cx="5943600" cy="4592955"/>
+                    </a:xfrm>
+                    <a:prstGeom prst="rect">
+                      <a:avLst/>
+                    </a:prstGeom>
+                  </pic:spPr>
+                </pic:pic>
+              </a:graphicData>
+            </a:graphic>
+          </wp:inline>
+        </w:drawing>
       </w:r>
     </w:p>
     <w:p>
@@ -2699,6 +2945,50 @@
         </w:rPr>
         <w:t xml:space="preserve"> the backend, the Trip model (defined using Mongoose schema) specifies the structure of trip documents with properties like code, name, length, start, resort, perPerson, image, and description. The TripController class contains methods like tripsList(), tripsAddTrip(), tripsGetCode(), and tripsUpdateTrip() that handle business logic for CRUD operations. The AuthenticationController manages user login and token generation. These classes work together through dependency injection and service patterns—Angular components depend on services for data access, services communicate with Express controllers via HTTP, and controllers interact with Mongoose models to persist data in MongoDB.</w:t>
       </w:r>
+    </w:p>
+    <w:p>
+      <w:pPr>
+        <w:suppressAutoHyphens/>
+        <w:contextualSpacing/>
+        <w:rPr>
+          <w:rFonts w:asciiTheme="majorHAnsi" w:hAnsiTheme="majorHAnsi" w:cstheme="majorHAnsi"/>
+          <w:sz w:val="22"/>
+          <w:szCs w:val="22"/>
+        </w:rPr>
+      </w:pPr>
+    </w:p>
+    <w:p>
+      <w:pPr>
+        <w:suppressAutoHyphens/>
+        <w:contextualSpacing/>
+        <w:rPr>
+          <w:rFonts w:asciiTheme="majorHAnsi" w:hAnsiTheme="majorHAnsi" w:cstheme="majorHAnsi"/>
+          <w:sz w:val="22"/>
+          <w:szCs w:val="22"/>
+        </w:rPr>
+      </w:pPr>
+    </w:p>
+    <w:p>
+      <w:pPr>
+        <w:suppressAutoHyphens/>
+        <w:contextualSpacing/>
+        <w:rPr>
+          <w:rFonts w:asciiTheme="majorHAnsi" w:hAnsiTheme="majorHAnsi" w:cstheme="majorHAnsi"/>
+          <w:sz w:val="22"/>
+          <w:szCs w:val="22"/>
+        </w:rPr>
+      </w:pPr>
+    </w:p>
+    <w:p>
+      <w:pPr>
+        <w:suppressAutoHyphens/>
+        <w:contextualSpacing/>
+        <w:rPr>
+          <w:rFonts w:asciiTheme="majorHAnsi" w:hAnsiTheme="majorHAnsi" w:cstheme="majorHAnsi"/>
+          <w:sz w:val="22"/>
+          <w:szCs w:val="22"/>
+        </w:rPr>
+      </w:pPr>
     </w:p>
     <w:p>
       <w:pPr>
@@ -2738,6 +3028,7 @@
       </w:r>
       <w:bookmarkEnd w:id="13"/>
     </w:p>
+    <w:p/>
     <w:tbl>
       <w:tblPr>
         <w:tblStyle w:val="a4"/>
@@ -2793,7 +3084,6 @@
                 <w:sz w:val="22"/>
                 <w:szCs w:val="22"/>
               </w:rPr>
-              <w:lastRenderedPageBreak/>
               <w:t>Method</w:t>
             </w:r>
           </w:p>
@@ -3765,6 +4055,7 @@
           <w:tag w:val="goog_rdk_0"/>
           <w:id w:val="218947832"/>
         </w:sdtPr>
+        <w:sdtEndPr/>
         <w:sdtContent/>
       </w:sdt>
       <w:r>
@@ -3964,7 +4255,7 @@
           <w:sz w:val="22"/>
           <w:szCs w:val="22"/>
         </w:rPr>
-        <w:t xml:space="preserve"> PUT requests to /api/trips/:tripCode sending updated trip data. Angular’s development server provides live reload, allowing immediate verification of changes. For systematic testing, developers can use Angular’s built-in testing framework with Jasmine and Karma to write unit tests for components and services. Integration testing verifies that clicking “Edit” loads trip data into the form, modifying fields updates the model, and </w:t>
+        <w:t xml:space="preserve"> PUT requests to </w:t>
       </w:r>
       <w:r>
         <w:rPr>
@@ -3973,12 +4264,12 @@
           <w:szCs w:val="22"/>
         </w:rPr>
         <w:lastRenderedPageBreak/>
-        <w:t>submitting sends the correct PUT request. Successful API communication is confirmed when the database reflects changes and the UI updates accordingly without page refreshes.</w:t>
+        <w:t>/api/trips/:tripCode sending updated trip data. Angular’s development server provides live reload, allowing immediate verification of changes. For systematic testing, developers can use Angular’s built-in testing framework with Jasmine and Karma to write unit tests for components and services. Integration testing verifies that clicking “Edit” loads trip data into the form, modifying fields updates the model, and submitting sends the correct PUT request. Successful API communication is confirmed when the database reflects changes and the UI updates accordingly without page refreshes.</w:t>
       </w:r>
     </w:p>
     <w:sectPr>
-      <w:footerReference w:type="even" r:id="rId14"/>
-      <w:footerReference w:type="default" r:id="rId15"/>
+      <w:footerReference w:type="even" r:id="rId16"/>
+      <w:footerReference w:type="default" r:id="rId17"/>
       <w:pgSz w:w="12240" w:h="15840"/>
       <w:pgMar w:top="1440" w:right="1440" w:bottom="1440" w:left="1440" w:header="720" w:footer="720" w:gutter="0"/>
       <w:pgNumType w:start="1"/>
@@ -5448,18 +5739,27 @@
 </file>
 
 <file path=customXml/item1.xml><?xml version="1.0" encoding="utf-8"?>
+<?mso-contentType ?>
+<FormTemplates xmlns="http://schemas.microsoft.com/sharepoint/v3/contenttype/forms">
+  <Display>DocumentLibraryForm</Display>
+  <Edit>DocumentLibraryForm</Edit>
+  <New>DocumentLibraryForm</New>
+</FormTemplates>
+</file>
+
+<file path=customXml/item2.xml><?xml version="1.0" encoding="utf-8"?>
 <go:gDocsCustomXmlDataStorage xmlns:r="http://schemas.openxmlformats.org/officeDocument/2006/relationships" xmlns:go="http://customooxmlschemas.google.com/">
   <go:docsCustomData xmlns:go="http://customooxmlschemas.google.com/" roundtripDataSignature="AMtx7mhlQxUlYotSxlzb/K+26fkCr5Qlkw==">AMUW2mW1kN5agRxwVIWyD/m6beqkmXuOJ9L+jXyq6OrT8A7uOkGRZeTuNxoWv36g8BJCXl4uefNfMOi9mZH/d1SUUadKtuTNwxRVRTTjHLfUoJAQulT1ojg=</go:docsCustomData>
 </go:gDocsCustomXmlDataStorage>
 </file>
 
-<file path=customXml/item2.xml><?xml version="1.0" encoding="utf-8"?>
+<file path=customXml/item3.xml><?xml version="1.0" encoding="utf-8"?>
 <p:properties xmlns:p="http://schemas.microsoft.com/office/2006/metadata/properties" xmlns:xsi="http://www.w3.org/2001/XMLSchema-instance" xmlns:pc="http://schemas.microsoft.com/office/infopath/2007/PartnerControls">
   <documentManagement/>
 </p:properties>
 </file>
 
-<file path=customXml/item3.xml><?xml version="1.0" encoding="utf-8"?>
+<file path=customXml/item4.xml><?xml version="1.0" encoding="utf-8"?>
 <ct:contentTypeSchema xmlns:ct="http://schemas.microsoft.com/office/2006/metadata/contentType" xmlns:ma="http://schemas.microsoft.com/office/2006/metadata/properties/metaAttributes" ct:_="" ma:_="" ma:contentTypeName="Document" ma:contentTypeID="0x01010019267F6D1A260A4394C18F5AF72445EA" ma:contentTypeVersion="3" ma:contentTypeDescription="Create a new document." ma:contentTypeScope="" ma:versionID="d6a723735a0ade9a92961b83aee31dda">
   <xsd:schema xmlns:xsd="http://www.w3.org/2001/XMLSchema" xmlns:xs="http://www.w3.org/2001/XMLSchema" xmlns:p="http://schemas.microsoft.com/office/2006/metadata/properties" targetNamespace="http://schemas.microsoft.com/office/2006/metadata/properties" ma:root="true" ma:fieldsID="e345bd7673956a623930e5662e321f3a">
     <xsd:element name="properties">
@@ -5573,16 +5873,15 @@
 </ct:contentTypeSchema>
 </file>
 
-<file path=customXml/item4.xml><?xml version="1.0" encoding="utf-8"?>
-<?mso-contentType ?>
-<FormTemplates xmlns="http://schemas.microsoft.com/sharepoint/v3/contenttype/forms">
-  <Display>DocumentLibraryForm</Display>
-  <Edit>DocumentLibraryForm</Edit>
-  <New>DocumentLibraryForm</New>
-</FormTemplates>
+<file path=customXml/itemProps1.xml><?xml version="1.0" encoding="utf-8"?>
+<ds:datastoreItem xmlns:ds="http://schemas.openxmlformats.org/officeDocument/2006/customXml" ds:itemID="{DFAA2243-9B12-47D3-B8CD-149B296ED07C}">
+  <ds:schemaRefs>
+    <ds:schemaRef ds:uri="http://schemas.microsoft.com/sharepoint/v3/contenttype/forms"/>
+  </ds:schemaRefs>
+</ds:datastoreItem>
 </file>
 
-<file path=customXml/itemProps1.xml><?xml version="1.0" encoding="utf-8"?>
+<file path=customXml/itemProps2.xml><?xml version="1.0" encoding="utf-8"?>
 <ds:datastoreItem xmlns:ds="http://schemas.openxmlformats.org/officeDocument/2006/customXml" ds:itemID="{11111111-1234-1234-1234-123412341234}">
   <ds:schemaRefs>
     <ds:schemaRef ds:uri="http://schemas.openxmlformats.org/officeDocument/2006/relationships"/>
@@ -5591,7 +5890,7 @@
 </ds:datastoreItem>
 </file>
 
-<file path=customXml/itemProps2.xml><?xml version="1.0" encoding="utf-8"?>
+<file path=customXml/itemProps3.xml><?xml version="1.0" encoding="utf-8"?>
 <ds:datastoreItem xmlns:ds="http://schemas.openxmlformats.org/officeDocument/2006/customXml" ds:itemID="{6029DA15-9DFC-4A0A-8033-CAECD90791BB}">
   <ds:schemaRefs>
     <ds:schemaRef ds:uri="http://schemas.microsoft.com/office/2006/metadata/properties"/>
@@ -5600,7 +5899,7 @@
 </ds:datastoreItem>
 </file>
 
-<file path=customXml/itemProps3.xml><?xml version="1.0" encoding="utf-8"?>
+<file path=customXml/itemProps4.xml><?xml version="1.0" encoding="utf-8"?>
 <ds:datastoreItem xmlns:ds="http://schemas.openxmlformats.org/officeDocument/2006/customXml" ds:itemID="{0B67D417-F46B-459B-BE4A-CE060E0409B1}">
   <ds:schemaRefs>
     <ds:schemaRef ds:uri="http://schemas.microsoft.com/office/2006/metadata/contentType"/>
@@ -5614,12 +5913,4 @@
     <ds:schemaRef ds:uri="http://schemas.microsoft.com/office/infopath/2007/PartnerControls"/>
   </ds:schemaRefs>
 </ds:datastoreItem>
-</file>
-
-<file path=customXml/itemProps4.xml><?xml version="1.0" encoding="utf-8"?>
-<ds:datastoreItem xmlns:ds="http://schemas.openxmlformats.org/officeDocument/2006/customXml" ds:itemID="{DFAA2243-9B12-47D3-B8CD-149B296ED07C}">
-  <ds:schemaRefs>
-    <ds:schemaRef ds:uri="http://schemas.microsoft.com/sharepoint/v3/contenttype/forms"/>
-  </ds:schemaRefs>
-</ds:datastoreItem>
 </file>
</xml_diff>

<commit_message>
Final CS465 submission - updated API, Angular services, JWT security, SDD v3.0
</commit_message>
<xml_diff>
--- a/CS 465 Software Design Document JME.docx
+++ b/CS 465 Software Design Document JME.docx
@@ -237,7 +237,6 @@
           <w:docPartUnique/>
         </w:docPartObj>
       </w:sdtPr>
-      <w:sdtEndPr/>
       <w:sdtContent>
         <w:p>
           <w:pPr>
@@ -1823,6 +1822,129 @@
           </w:p>
         </w:tc>
       </w:tr>
+      <w:tr>
+        <w:tc>
+          <w:tcPr>
+            <w:tcW w:w="978" w:type="dxa"/>
+            <w:tcMar>
+              <w:top w:w="0" w:type="dxa"/>
+              <w:left w:w="115" w:type="dxa"/>
+              <w:bottom w:w="0" w:type="dxa"/>
+              <w:right w:w="115" w:type="dxa"/>
+            </w:tcMar>
+          </w:tcPr>
+          <w:p>
+            <w:pPr>
+              <w:suppressAutoHyphens/>
+              <w:contextualSpacing/>
+              <w:jc w:val="center"/>
+              <w:rPr>
+                <w:rFonts w:asciiTheme="majorHAnsi" w:hAnsiTheme="majorHAnsi" w:cstheme="majorHAnsi"/>
+                <w:sz w:val="22"/>
+                <w:szCs w:val="22"/>
+              </w:rPr>
+            </w:pPr>
+            <w:r>
+              <w:rPr>
+                <w:rFonts w:asciiTheme="majorHAnsi" w:hAnsiTheme="majorHAnsi" w:cstheme="majorHAnsi"/>
+                <w:sz w:val="22"/>
+                <w:szCs w:val="22"/>
+              </w:rPr>
+              <w:t>3.0</w:t>
+            </w:r>
+          </w:p>
+        </w:tc>
+        <w:tc>
+          <w:tcPr>
+            <w:tcW w:w="1530" w:type="dxa"/>
+            <w:tcMar>
+              <w:top w:w="0" w:type="dxa"/>
+              <w:left w:w="115" w:type="dxa"/>
+              <w:bottom w:w="0" w:type="dxa"/>
+              <w:right w:w="115" w:type="dxa"/>
+            </w:tcMar>
+          </w:tcPr>
+          <w:p>
+            <w:pPr>
+              <w:suppressAutoHyphens/>
+              <w:contextualSpacing/>
+              <w:rPr>
+                <w:rFonts w:asciiTheme="majorHAnsi" w:hAnsiTheme="majorHAnsi" w:cstheme="majorHAnsi"/>
+                <w:sz w:val="22"/>
+                <w:szCs w:val="22"/>
+              </w:rPr>
+            </w:pPr>
+            <w:r>
+              <w:rPr>
+                <w:rFonts w:asciiTheme="majorHAnsi" w:hAnsiTheme="majorHAnsi" w:cstheme="majorHAnsi"/>
+                <w:sz w:val="22"/>
+                <w:szCs w:val="22"/>
+              </w:rPr>
+              <w:t>02/21/2026</w:t>
+            </w:r>
+          </w:p>
+        </w:tc>
+        <w:tc>
+          <w:tcPr>
+            <w:tcW w:w="1725" w:type="dxa"/>
+            <w:tcMar>
+              <w:top w:w="0" w:type="dxa"/>
+              <w:left w:w="115" w:type="dxa"/>
+              <w:bottom w:w="0" w:type="dxa"/>
+              <w:right w:w="115" w:type="dxa"/>
+            </w:tcMar>
+          </w:tcPr>
+          <w:p>
+            <w:pPr>
+              <w:suppressAutoHyphens/>
+              <w:contextualSpacing/>
+              <w:rPr>
+                <w:rFonts w:asciiTheme="majorHAnsi" w:hAnsiTheme="majorHAnsi" w:cstheme="majorHAnsi"/>
+                <w:sz w:val="22"/>
+                <w:szCs w:val="22"/>
+              </w:rPr>
+            </w:pPr>
+            <w:r>
+              <w:rPr>
+                <w:rFonts w:asciiTheme="majorHAnsi" w:hAnsiTheme="majorHAnsi" w:cstheme="majorHAnsi"/>
+                <w:sz w:val="22"/>
+                <w:szCs w:val="22"/>
+              </w:rPr>
+              <w:t>Jose Morales Egipciaco</w:t>
+            </w:r>
+          </w:p>
+        </w:tc>
+        <w:tc>
+          <w:tcPr>
+            <w:tcW w:w="5109" w:type="dxa"/>
+            <w:tcMar>
+              <w:top w:w="0" w:type="dxa"/>
+              <w:left w:w="115" w:type="dxa"/>
+              <w:bottom w:w="0" w:type="dxa"/>
+              <w:right w:w="115" w:type="dxa"/>
+            </w:tcMar>
+          </w:tcPr>
+          <w:p>
+            <w:pPr>
+              <w:suppressAutoHyphens/>
+              <w:contextualSpacing/>
+              <w:rPr>
+                <w:rFonts w:asciiTheme="majorHAnsi" w:hAnsiTheme="majorHAnsi" w:cstheme="majorHAnsi"/>
+                <w:sz w:val="22"/>
+                <w:szCs w:val="22"/>
+              </w:rPr>
+            </w:pPr>
+            <w:r>
+              <w:rPr>
+                <w:rFonts w:asciiTheme="majorHAnsi" w:hAnsiTheme="majorHAnsi" w:cstheme="majorHAnsi"/>
+                <w:sz w:val="22"/>
+                <w:szCs w:val="22"/>
+              </w:rPr>
+              <w:t>Final Project Submission – Added SPA screenshots, API testing, Security validation</w:t>
+            </w:r>
+          </w:p>
+        </w:tc>
+      </w:tr>
     </w:tbl>
     <w:p>
       <w:pPr>
@@ -2057,6 +2179,36 @@
     </w:p>
     <w:p>
       <w:pPr>
+        <w:suppressAutoHyphens/>
+        <w:contextualSpacing/>
+        <w:rPr>
+          <w:rFonts w:asciiTheme="majorHAnsi" w:hAnsiTheme="majorHAnsi" w:cstheme="majorHAnsi"/>
+          <w:sz w:val="22"/>
+          <w:szCs w:val="22"/>
+        </w:rPr>
+      </w:pPr>
+      <w:r>
+        <w:rPr>
+          <w:rFonts w:asciiTheme="majorHAnsi" w:hAnsiTheme="majorHAnsi" w:cstheme="majorHAnsi"/>
+          <w:sz w:val="22"/>
+          <w:szCs w:val="22"/>
+        </w:rPr>
+        <w:t>The MEAN stack provides a unified JavaScript development environment that simplifies maintenance and scalability. By separating the customer-facing site and the administrator SPA, the architecture supports both SEO optimization and rich administrative functionality. The integration of JWT-based authentication ensures secure data access, aligning with the client’s requirement for protected administrative controls. This layered architecture supports future enhancements such as reservation tracking and payment integration without structural redesign.</w:t>
+      </w:r>
+    </w:p>
+    <w:p>
+      <w:pPr>
+        <w:suppressAutoHyphens/>
+        <w:contextualSpacing/>
+        <w:rPr>
+          <w:rFonts w:asciiTheme="majorHAnsi" w:hAnsiTheme="majorHAnsi" w:cstheme="majorHAnsi"/>
+          <w:sz w:val="22"/>
+          <w:szCs w:val="22"/>
+        </w:rPr>
+      </w:pPr>
+    </w:p>
+    <w:p>
+      <w:pPr>
         <w:pStyle w:val="Heading2"/>
         <w:suppressAutoHyphens/>
         <w:contextualSpacing/>
@@ -2333,7 +2485,6 @@
         <w:rPr>
           <w:rFonts w:asciiTheme="majorHAnsi" w:hAnsiTheme="majorHAnsi" w:cstheme="majorHAnsi"/>
         </w:rPr>
-        <w:lastRenderedPageBreak/>
         <w:t>Component Diagram</w:t>
       </w:r>
       <w:bookmarkEnd w:id="8"/>
@@ -2367,7 +2518,7 @@
           <w:szCs w:val="22"/>
         </w:rPr>
         <w:drawing>
-          <wp:inline distT="0" distB="0" distL="0" distR="0" wp14:anchorId="319AC12D" wp14:editId="12849DCD">
+          <wp:inline distT="0" distB="0" distL="0" distR="0" wp14:anchorId="319AC12D" wp14:editId="3F564DB9">
             <wp:extent cx="5513696" cy="4147053"/>
             <wp:effectExtent l="0" t="0" r="0" b="6350"/>
             <wp:docPr id="1" name="Picture 1" descr="Please see the hyperlinked Word Document &quot;CS 465 Full Stack Component Diagram Text Version&quot; for alternative text. "/>
@@ -2531,63 +2682,17 @@
           <w:sz w:val="22"/>
           <w:szCs w:val="22"/>
         </w:rPr>
-        <w:t>The data tier utilizes MongoDB to store trip information and application data in flexible documents. Mongoose acts as the Object Data Modeling library, allowing the server to interact with the database through structured models. Together, these tiers create a cohesive full-stack system where the frontend communicates with Express, Express processes logic and interacts with MongoDB, and data flows back to update the user interface.</w:t>
-      </w:r>
-    </w:p>
-    <w:p>
-      <w:pPr>
-        <w:suppressAutoHyphens/>
-        <w:contextualSpacing/>
-        <w:rPr>
-          <w:rFonts w:asciiTheme="majorHAnsi" w:hAnsiTheme="majorHAnsi" w:cstheme="majorHAnsi"/>
-          <w:sz w:val="22"/>
-          <w:szCs w:val="22"/>
-        </w:rPr>
-      </w:pPr>
-    </w:p>
-    <w:p>
-      <w:pPr>
-        <w:suppressAutoHyphens/>
-        <w:contextualSpacing/>
-        <w:rPr>
-          <w:rFonts w:asciiTheme="majorHAnsi" w:hAnsiTheme="majorHAnsi" w:cstheme="majorHAnsi"/>
-          <w:sz w:val="22"/>
-          <w:szCs w:val="22"/>
-        </w:rPr>
-      </w:pPr>
-    </w:p>
-    <w:p>
-      <w:pPr>
-        <w:suppressAutoHyphens/>
-        <w:contextualSpacing/>
-        <w:rPr>
-          <w:rFonts w:asciiTheme="majorHAnsi" w:hAnsiTheme="majorHAnsi" w:cstheme="majorHAnsi"/>
-          <w:sz w:val="22"/>
-          <w:szCs w:val="22"/>
-        </w:rPr>
-      </w:pPr>
-    </w:p>
-    <w:p>
-      <w:pPr>
-        <w:suppressAutoHyphens/>
-        <w:contextualSpacing/>
-        <w:rPr>
-          <w:rFonts w:asciiTheme="majorHAnsi" w:hAnsiTheme="majorHAnsi" w:cstheme="majorHAnsi"/>
-          <w:sz w:val="22"/>
-          <w:szCs w:val="22"/>
-        </w:rPr>
-      </w:pPr>
-    </w:p>
-    <w:p>
-      <w:pPr>
-        <w:suppressAutoHyphens/>
-        <w:contextualSpacing/>
-        <w:rPr>
-          <w:rFonts w:asciiTheme="majorHAnsi" w:hAnsiTheme="majorHAnsi" w:cstheme="majorHAnsi"/>
-          <w:sz w:val="22"/>
-          <w:szCs w:val="22"/>
-        </w:rPr>
-      </w:pPr>
+        <w:t xml:space="preserve">The data tier utilizes MongoDB to store trip information and application data in flexible documents. Mongoose acts as the Object Data Modeling library, allowing the server to interact with the database </w:t>
+      </w:r>
+      <w:r>
+        <w:rPr>
+          <w:rFonts w:asciiTheme="majorHAnsi" w:hAnsiTheme="majorHAnsi" w:cstheme="majorHAnsi"/>
+          <w:sz w:val="22"/>
+          <w:szCs w:val="22"/>
+        </w:rPr>
+        <w:lastRenderedPageBreak/>
+        <w:t>through structured models. Together, these tiers create a cohesive full-stack system where the frontend communicates with Express, Express processes logic and interacts with MongoDB, and data flows back to update the user interface.</w:t>
+      </w:r>
     </w:p>
     <w:p>
       <w:pPr>
@@ -2651,7 +2756,7 @@
           <w:szCs w:val="22"/>
         </w:rPr>
         <w:drawing>
-          <wp:inline distT="0" distB="0" distL="0" distR="0" wp14:anchorId="287F65ED" wp14:editId="31D9FB26">
+          <wp:inline distT="0" distB="0" distL="0" distR="0" wp14:anchorId="287F65ED" wp14:editId="6E72A5FA">
             <wp:extent cx="5943600" cy="4592955"/>
             <wp:effectExtent l="0" t="0" r="0" b="0"/>
             <wp:docPr id="1090361212" name="Picture 1"/>
@@ -2739,37 +2844,91 @@
           <w:sz w:val="22"/>
           <w:szCs w:val="22"/>
         </w:rPr>
-        <w:t>For admin authentication, the Angular SPA sends credentials via an HTTP POST request to the /api/login endpoint. Express validates these credentials against stored user data in MongoDB. If valid, the server generates a JSON Web Token (JWT) and returns it to the Angular app, which stores it for subsequent authenticated requests.</w:t>
-      </w:r>
-    </w:p>
-    <w:p>
-      <w:pPr>
-        <w:suppressAutoHyphens/>
-        <w:contextualSpacing/>
-        <w:rPr>
-          <w:rFonts w:asciiTheme="majorHAnsi" w:hAnsiTheme="majorHAnsi" w:cstheme="majorHAnsi"/>
-          <w:sz w:val="22"/>
-          <w:szCs w:val="22"/>
-        </w:rPr>
-      </w:pPr>
-    </w:p>
-    <w:p>
-      <w:pPr>
-        <w:suppressAutoHyphens/>
-        <w:contextualSpacing/>
-        <w:rPr>
-          <w:rFonts w:asciiTheme="majorHAnsi" w:hAnsiTheme="majorHAnsi" w:cstheme="majorHAnsi"/>
-          <w:sz w:val="22"/>
-          <w:szCs w:val="22"/>
-        </w:rPr>
-      </w:pPr>
-      <w:r>
-        <w:rPr>
-          <w:rFonts w:asciiTheme="majorHAnsi" w:hAnsiTheme="majorHAnsi" w:cstheme="majorHAnsi"/>
-          <w:sz w:val="22"/>
-          <w:szCs w:val="22"/>
-        </w:rPr>
-        <w:t xml:space="preserve">Admin CRUD operations follow a similar pattern with added authentication. When an administrator updates a trip, the Angular app sends a PUT request to /api/trips/:tripId with the JWT in the request header. Express middleware validates the token, then the trip controller processes the update request. Mongoose updates the specified document in MongoDB, and the database confirms the operation. The success response flows back through Express to the Angular app, which updates its local state and </w:t>
+        <w:t>For admin authentication, the Angular SPA sends credentials via an HTTP POST request to the /</w:t>
+      </w:r>
+      <w:proofErr w:type="spellStart"/>
+      <w:r>
+        <w:rPr>
+          <w:rFonts w:asciiTheme="majorHAnsi" w:hAnsiTheme="majorHAnsi" w:cstheme="majorHAnsi"/>
+          <w:sz w:val="22"/>
+          <w:szCs w:val="22"/>
+        </w:rPr>
+        <w:t>api</w:t>
+      </w:r>
+      <w:proofErr w:type="spellEnd"/>
+      <w:r>
+        <w:rPr>
+          <w:rFonts w:asciiTheme="majorHAnsi" w:hAnsiTheme="majorHAnsi" w:cstheme="majorHAnsi"/>
+          <w:sz w:val="22"/>
+          <w:szCs w:val="22"/>
+        </w:rPr>
+        <w:t>/login endpoint. Express validates these credentials against stored user data in MongoDB. If valid, the server generates a JSON Web Token (JWT) and returns it to the Angular app, which stores it for subsequent authenticated requests.</w:t>
+      </w:r>
+    </w:p>
+    <w:p>
+      <w:pPr>
+        <w:suppressAutoHyphens/>
+        <w:contextualSpacing/>
+        <w:rPr>
+          <w:rFonts w:asciiTheme="majorHAnsi" w:hAnsiTheme="majorHAnsi" w:cstheme="majorHAnsi"/>
+          <w:sz w:val="22"/>
+          <w:szCs w:val="22"/>
+        </w:rPr>
+      </w:pPr>
+    </w:p>
+    <w:p>
+      <w:pPr>
+        <w:suppressAutoHyphens/>
+        <w:contextualSpacing/>
+        <w:rPr>
+          <w:rFonts w:asciiTheme="majorHAnsi" w:hAnsiTheme="majorHAnsi" w:cstheme="majorHAnsi"/>
+          <w:sz w:val="22"/>
+          <w:szCs w:val="22"/>
+        </w:rPr>
+      </w:pPr>
+      <w:r>
+        <w:rPr>
+          <w:rFonts w:asciiTheme="majorHAnsi" w:hAnsiTheme="majorHAnsi" w:cstheme="majorHAnsi"/>
+          <w:sz w:val="22"/>
+          <w:szCs w:val="22"/>
+        </w:rPr>
+        <w:t>Admin CRUD operations follow a similar pattern with added authentication. When an administrator updates a trip, the Angular app sends a PUT request to /</w:t>
+      </w:r>
+      <w:proofErr w:type="spellStart"/>
+      <w:r>
+        <w:rPr>
+          <w:rFonts w:asciiTheme="majorHAnsi" w:hAnsiTheme="majorHAnsi" w:cstheme="majorHAnsi"/>
+          <w:sz w:val="22"/>
+          <w:szCs w:val="22"/>
+        </w:rPr>
+        <w:t>api</w:t>
+      </w:r>
+      <w:proofErr w:type="spellEnd"/>
+      <w:r>
+        <w:rPr>
+          <w:rFonts w:asciiTheme="majorHAnsi" w:hAnsiTheme="majorHAnsi" w:cstheme="majorHAnsi"/>
+          <w:sz w:val="22"/>
+          <w:szCs w:val="22"/>
+        </w:rPr>
+        <w:t>/trips/:</w:t>
+      </w:r>
+      <w:proofErr w:type="spellStart"/>
+      <w:r>
+        <w:rPr>
+          <w:rFonts w:asciiTheme="majorHAnsi" w:hAnsiTheme="majorHAnsi" w:cstheme="majorHAnsi"/>
+          <w:sz w:val="22"/>
+          <w:szCs w:val="22"/>
+        </w:rPr>
+        <w:t>tripId</w:t>
+      </w:r>
+      <w:proofErr w:type="spellEnd"/>
+      <w:r>
+        <w:rPr>
+          <w:rFonts w:asciiTheme="majorHAnsi" w:hAnsiTheme="majorHAnsi" w:cstheme="majorHAnsi"/>
+          <w:sz w:val="22"/>
+          <w:szCs w:val="22"/>
+        </w:rPr>
+        <w:t xml:space="preserve"> with the JWT in the request header. Express middleware validates the token, then the trip controller processes the update request. Mongoose updates the specified document in MongoDB, and the database confirms the operation. The </w:t>
       </w:r>
       <w:r>
         <w:rPr>
@@ -2778,7 +2937,7 @@
           <w:szCs w:val="22"/>
         </w:rPr>
         <w:lastRenderedPageBreak/>
-        <w:t>refreshes the UI. This separation of concerns across tiers ensures security, maintainability, and scalability of the application.</w:t>
+        <w:t>success response flows back through Express to the Angular app, which updates its local state and refreshes the UI. This separation of concerns across tiers ensures security, maintainability, and scalability of the application.</w:t>
       </w:r>
     </w:p>
     <w:p>
@@ -2916,7 +3075,79 @@
           <w:sz w:val="22"/>
           <w:szCs w:val="22"/>
         </w:rPr>
-        <w:t>The application’s class structure includes several key Angular components and backend models. On the frontend, the TripListingComponent displays all available trips by consuming the TripDataService, which handles HTTP communication with the backend API. The TripCardComponent renders individual trip details, accepting trip data as input properties. The AddTripComponent and EditTripComponent manage form inputs for creating and modifying trips, utilizing Angular’s reactive forms for validation.</w:t>
+        <w:t xml:space="preserve">The application’s class structure includes several key Angular components and backend models. On the frontend, the </w:t>
+      </w:r>
+      <w:proofErr w:type="spellStart"/>
+      <w:r>
+        <w:rPr>
+          <w:rFonts w:asciiTheme="majorHAnsi" w:hAnsiTheme="majorHAnsi" w:cstheme="majorHAnsi"/>
+          <w:sz w:val="22"/>
+          <w:szCs w:val="22"/>
+        </w:rPr>
+        <w:t>TripListingComponent</w:t>
+      </w:r>
+      <w:proofErr w:type="spellEnd"/>
+      <w:r>
+        <w:rPr>
+          <w:rFonts w:asciiTheme="majorHAnsi" w:hAnsiTheme="majorHAnsi" w:cstheme="majorHAnsi"/>
+          <w:sz w:val="22"/>
+          <w:szCs w:val="22"/>
+        </w:rPr>
+        <w:t xml:space="preserve"> displays all available trips by consuming the </w:t>
+      </w:r>
+      <w:proofErr w:type="spellStart"/>
+      <w:r>
+        <w:rPr>
+          <w:rFonts w:asciiTheme="majorHAnsi" w:hAnsiTheme="majorHAnsi" w:cstheme="majorHAnsi"/>
+          <w:sz w:val="22"/>
+          <w:szCs w:val="22"/>
+        </w:rPr>
+        <w:t>TripDataService</w:t>
+      </w:r>
+      <w:proofErr w:type="spellEnd"/>
+      <w:r>
+        <w:rPr>
+          <w:rFonts w:asciiTheme="majorHAnsi" w:hAnsiTheme="majorHAnsi" w:cstheme="majorHAnsi"/>
+          <w:sz w:val="22"/>
+          <w:szCs w:val="22"/>
+        </w:rPr>
+        <w:t xml:space="preserve">, which handles HTTP communication with the backend API. The TripCardComponent renders individual trip details, accepting trip data as input properties. The AddTripComponent and </w:t>
+      </w:r>
+      <w:proofErr w:type="spellStart"/>
+      <w:r>
+        <w:rPr>
+          <w:rFonts w:asciiTheme="majorHAnsi" w:hAnsiTheme="majorHAnsi" w:cstheme="majorHAnsi"/>
+          <w:sz w:val="22"/>
+          <w:szCs w:val="22"/>
+        </w:rPr>
+        <w:t>EditTripComponent</w:t>
+      </w:r>
+      <w:proofErr w:type="spellEnd"/>
+      <w:r>
+        <w:rPr>
+          <w:rFonts w:asciiTheme="majorHAnsi" w:hAnsiTheme="majorHAnsi" w:cstheme="majorHAnsi"/>
+          <w:sz w:val="22"/>
+          <w:szCs w:val="22"/>
+        </w:rPr>
+        <w:t xml:space="preserve"> manage form inputs for creating and modifying trips, utilizing </w:t>
+      </w:r>
+      <w:proofErr w:type="spellStart"/>
+      <w:r>
+        <w:rPr>
+          <w:rFonts w:asciiTheme="majorHAnsi" w:hAnsiTheme="majorHAnsi" w:cstheme="majorHAnsi"/>
+          <w:sz w:val="22"/>
+          <w:szCs w:val="22"/>
+        </w:rPr>
+        <w:t>Angular’s</w:t>
+      </w:r>
+      <w:proofErr w:type="spellEnd"/>
+      <w:r>
+        <w:rPr>
+          <w:rFonts w:asciiTheme="majorHAnsi" w:hAnsiTheme="majorHAnsi" w:cstheme="majorHAnsi"/>
+          <w:sz w:val="22"/>
+          <w:szCs w:val="22"/>
+        </w:rPr>
+        <w:t xml:space="preserve"> reactive forms for validation.</w:t>
       </w:r>
     </w:p>
     <w:p>
@@ -2943,52 +3174,134 @@
           <w:sz w:val="22"/>
           <w:szCs w:val="22"/>
         </w:rPr>
-        <w:t xml:space="preserve"> the backend, the Trip model (defined using Mongoose schema) specifies the structure of trip documents with properties like code, name, length, start, resort, perPerson, image, and description. The TripController class contains methods like tripsList(), tripsAddTrip(), tripsGetCode(), and tripsUpdateTrip() that handle business logic for CRUD operations. The AuthenticationController manages user login and token generation. These classes work together through dependency injection and service patterns—Angular components depend on services for data access, services communicate with Express controllers via HTTP, and controllers interact with Mongoose models to persist data in MongoDB.</w:t>
-      </w:r>
-    </w:p>
-    <w:p>
-      <w:pPr>
-        <w:suppressAutoHyphens/>
-        <w:contextualSpacing/>
-        <w:rPr>
-          <w:rFonts w:asciiTheme="majorHAnsi" w:hAnsiTheme="majorHAnsi" w:cstheme="majorHAnsi"/>
-          <w:sz w:val="22"/>
-          <w:szCs w:val="22"/>
-        </w:rPr>
-      </w:pPr>
-    </w:p>
-    <w:p>
-      <w:pPr>
-        <w:suppressAutoHyphens/>
-        <w:contextualSpacing/>
-        <w:rPr>
-          <w:rFonts w:asciiTheme="majorHAnsi" w:hAnsiTheme="majorHAnsi" w:cstheme="majorHAnsi"/>
-          <w:sz w:val="22"/>
-          <w:szCs w:val="22"/>
-        </w:rPr>
-      </w:pPr>
-    </w:p>
-    <w:p>
-      <w:pPr>
-        <w:suppressAutoHyphens/>
-        <w:contextualSpacing/>
-        <w:rPr>
-          <w:rFonts w:asciiTheme="majorHAnsi" w:hAnsiTheme="majorHAnsi" w:cstheme="majorHAnsi"/>
-          <w:sz w:val="22"/>
-          <w:szCs w:val="22"/>
-        </w:rPr>
-      </w:pPr>
-    </w:p>
-    <w:p>
-      <w:pPr>
-        <w:suppressAutoHyphens/>
-        <w:contextualSpacing/>
-        <w:rPr>
-          <w:rFonts w:asciiTheme="majorHAnsi" w:hAnsiTheme="majorHAnsi" w:cstheme="majorHAnsi"/>
-          <w:sz w:val="22"/>
-          <w:szCs w:val="22"/>
-        </w:rPr>
-      </w:pPr>
+        <w:t xml:space="preserve"> the backend, the Trip model (defined using Mongoose schema) specifies the structure of trip documents with properties like code, name, length, start, resort, </w:t>
+      </w:r>
+      <w:proofErr w:type="spellStart"/>
+      <w:r>
+        <w:rPr>
+          <w:rFonts w:asciiTheme="majorHAnsi" w:hAnsiTheme="majorHAnsi" w:cstheme="majorHAnsi"/>
+          <w:sz w:val="22"/>
+          <w:szCs w:val="22"/>
+        </w:rPr>
+        <w:t>perPerson</w:t>
+      </w:r>
+      <w:proofErr w:type="spellEnd"/>
+      <w:r>
+        <w:rPr>
+          <w:rFonts w:asciiTheme="majorHAnsi" w:hAnsiTheme="majorHAnsi" w:cstheme="majorHAnsi"/>
+          <w:sz w:val="22"/>
+          <w:szCs w:val="22"/>
+        </w:rPr>
+        <w:t xml:space="preserve">, image, and description. The </w:t>
+      </w:r>
+      <w:proofErr w:type="spellStart"/>
+      <w:r>
+        <w:rPr>
+          <w:rFonts w:asciiTheme="majorHAnsi" w:hAnsiTheme="majorHAnsi" w:cstheme="majorHAnsi"/>
+          <w:sz w:val="22"/>
+          <w:szCs w:val="22"/>
+        </w:rPr>
+        <w:t>TripController</w:t>
+      </w:r>
+      <w:proofErr w:type="spellEnd"/>
+      <w:r>
+        <w:rPr>
+          <w:rFonts w:asciiTheme="majorHAnsi" w:hAnsiTheme="majorHAnsi" w:cstheme="majorHAnsi"/>
+          <w:sz w:val="22"/>
+          <w:szCs w:val="22"/>
+        </w:rPr>
+        <w:t xml:space="preserve"> class contains methods like </w:t>
+      </w:r>
+      <w:proofErr w:type="spellStart"/>
+      <w:r>
+        <w:rPr>
+          <w:rFonts w:asciiTheme="majorHAnsi" w:hAnsiTheme="majorHAnsi" w:cstheme="majorHAnsi"/>
+          <w:sz w:val="22"/>
+          <w:szCs w:val="22"/>
+        </w:rPr>
+        <w:t>tripsList</w:t>
+      </w:r>
+      <w:proofErr w:type="spellEnd"/>
+      <w:r>
+        <w:rPr>
+          <w:rFonts w:asciiTheme="majorHAnsi" w:hAnsiTheme="majorHAnsi" w:cstheme="majorHAnsi"/>
+          <w:sz w:val="22"/>
+          <w:szCs w:val="22"/>
+        </w:rPr>
+        <w:t xml:space="preserve">(), </w:t>
+      </w:r>
+      <w:proofErr w:type="spellStart"/>
+      <w:r>
+        <w:rPr>
+          <w:rFonts w:asciiTheme="majorHAnsi" w:hAnsiTheme="majorHAnsi" w:cstheme="majorHAnsi"/>
+          <w:sz w:val="22"/>
+          <w:szCs w:val="22"/>
+        </w:rPr>
+        <w:t>tripsAddTrip</w:t>
+      </w:r>
+      <w:proofErr w:type="spellEnd"/>
+      <w:r>
+        <w:rPr>
+          <w:rFonts w:asciiTheme="majorHAnsi" w:hAnsiTheme="majorHAnsi" w:cstheme="majorHAnsi"/>
+          <w:sz w:val="22"/>
+          <w:szCs w:val="22"/>
+        </w:rPr>
+        <w:t xml:space="preserve">(), </w:t>
+      </w:r>
+      <w:proofErr w:type="spellStart"/>
+      <w:r>
+        <w:rPr>
+          <w:rFonts w:asciiTheme="majorHAnsi" w:hAnsiTheme="majorHAnsi" w:cstheme="majorHAnsi"/>
+          <w:sz w:val="22"/>
+          <w:szCs w:val="22"/>
+        </w:rPr>
+        <w:t>tripsGetCode</w:t>
+      </w:r>
+      <w:proofErr w:type="spellEnd"/>
+      <w:r>
+        <w:rPr>
+          <w:rFonts w:asciiTheme="majorHAnsi" w:hAnsiTheme="majorHAnsi" w:cstheme="majorHAnsi"/>
+          <w:sz w:val="22"/>
+          <w:szCs w:val="22"/>
+        </w:rPr>
+        <w:t xml:space="preserve">(), and </w:t>
+      </w:r>
+      <w:proofErr w:type="spellStart"/>
+      <w:r>
+        <w:rPr>
+          <w:rFonts w:asciiTheme="majorHAnsi" w:hAnsiTheme="majorHAnsi" w:cstheme="majorHAnsi"/>
+          <w:sz w:val="22"/>
+          <w:szCs w:val="22"/>
+        </w:rPr>
+        <w:t>tripsUpdateTrip</w:t>
+      </w:r>
+      <w:proofErr w:type="spellEnd"/>
+      <w:r>
+        <w:rPr>
+          <w:rFonts w:asciiTheme="majorHAnsi" w:hAnsiTheme="majorHAnsi" w:cstheme="majorHAnsi"/>
+          <w:sz w:val="22"/>
+          <w:szCs w:val="22"/>
+        </w:rPr>
+        <w:t xml:space="preserve">() that handle business logic for CRUD operations. The </w:t>
+      </w:r>
+      <w:proofErr w:type="spellStart"/>
+      <w:r>
+        <w:rPr>
+          <w:rFonts w:asciiTheme="majorHAnsi" w:hAnsiTheme="majorHAnsi" w:cstheme="majorHAnsi"/>
+          <w:sz w:val="22"/>
+          <w:szCs w:val="22"/>
+        </w:rPr>
+        <w:t>AuthenticationController</w:t>
+      </w:r>
+      <w:proofErr w:type="spellEnd"/>
+      <w:r>
+        <w:rPr>
+          <w:rFonts w:asciiTheme="majorHAnsi" w:hAnsiTheme="majorHAnsi" w:cstheme="majorHAnsi"/>
+          <w:sz w:val="22"/>
+          <w:szCs w:val="22"/>
+        </w:rPr>
+        <w:t xml:space="preserve"> manages user login and token generation. These classes work together through dependency injection and service patterns—Angular components depend on services for data access, services communicate with Express controllers via HTTP, and controllers interact with Mongoose models to persist data in MongoDB.</w:t>
+      </w:r>
     </w:p>
     <w:p>
       <w:pPr>
@@ -3287,7 +3600,25 @@
                 <w:sz w:val="22"/>
                 <w:szCs w:val="22"/>
               </w:rPr>
-              <w:t>/api/</w:t>
+              <w:t>/</w:t>
+            </w:r>
+            <w:proofErr w:type="spellStart"/>
+            <w:r>
+              <w:rPr>
+                <w:rFonts w:asciiTheme="majorHAnsi" w:hAnsiTheme="majorHAnsi" w:cstheme="majorHAnsi"/>
+                <w:sz w:val="22"/>
+                <w:szCs w:val="22"/>
+              </w:rPr>
+              <w:t>api</w:t>
+            </w:r>
+            <w:proofErr w:type="spellEnd"/>
+            <w:r>
+              <w:rPr>
+                <w:rFonts w:asciiTheme="majorHAnsi" w:hAnsiTheme="majorHAnsi" w:cstheme="majorHAnsi"/>
+                <w:sz w:val="22"/>
+                <w:szCs w:val="22"/>
+              </w:rPr>
+              <w:t>/</w:t>
             </w:r>
             <w:r>
               <w:rPr>
@@ -3429,8 +3760,36 @@
                 <w:sz w:val="22"/>
                 <w:szCs w:val="22"/>
               </w:rPr>
-              <w:t>/api/trips/:tripCode</w:t>
-            </w:r>
+              <w:t>/</w:t>
+            </w:r>
+            <w:proofErr w:type="spellStart"/>
+            <w:r>
+              <w:rPr>
+                <w:rFonts w:asciiTheme="majorHAnsi" w:hAnsiTheme="majorHAnsi" w:cstheme="majorHAnsi"/>
+                <w:sz w:val="22"/>
+                <w:szCs w:val="22"/>
+              </w:rPr>
+              <w:t>api</w:t>
+            </w:r>
+            <w:proofErr w:type="spellEnd"/>
+            <w:r>
+              <w:rPr>
+                <w:rFonts w:asciiTheme="majorHAnsi" w:hAnsiTheme="majorHAnsi" w:cstheme="majorHAnsi"/>
+                <w:sz w:val="22"/>
+                <w:szCs w:val="22"/>
+              </w:rPr>
+              <w:t>/trips/:</w:t>
+            </w:r>
+            <w:proofErr w:type="spellStart"/>
+            <w:r>
+              <w:rPr>
+                <w:rFonts w:asciiTheme="majorHAnsi" w:hAnsiTheme="majorHAnsi" w:cstheme="majorHAnsi"/>
+                <w:sz w:val="22"/>
+                <w:szCs w:val="22"/>
+              </w:rPr>
+              <w:t>tripCode</w:t>
+            </w:r>
+            <w:proofErr w:type="spellEnd"/>
           </w:p>
         </w:tc>
         <w:tc>
@@ -3557,13 +3916,23 @@
               </w:rPr>
               <w:t>/</w:t>
             </w:r>
-            <w:r>
-              <w:rPr>
-                <w:rFonts w:asciiTheme="majorHAnsi" w:hAnsiTheme="majorHAnsi" w:cstheme="majorHAnsi"/>
-                <w:sz w:val="22"/>
-                <w:szCs w:val="22"/>
-              </w:rPr>
-              <w:t>api/trips</w:t>
+            <w:proofErr w:type="spellStart"/>
+            <w:r>
+              <w:rPr>
+                <w:rFonts w:asciiTheme="majorHAnsi" w:hAnsiTheme="majorHAnsi" w:cstheme="majorHAnsi"/>
+                <w:sz w:val="22"/>
+                <w:szCs w:val="22"/>
+              </w:rPr>
+              <w:t>api</w:t>
+            </w:r>
+            <w:proofErr w:type="spellEnd"/>
+            <w:r>
+              <w:rPr>
+                <w:rFonts w:asciiTheme="majorHAnsi" w:hAnsiTheme="majorHAnsi" w:cstheme="majorHAnsi"/>
+                <w:sz w:val="22"/>
+                <w:szCs w:val="22"/>
+              </w:rPr>
+              <w:t>/trips</w:t>
             </w:r>
           </w:p>
         </w:tc>
@@ -3689,8 +4058,36 @@
                 <w:sz w:val="22"/>
                 <w:szCs w:val="22"/>
               </w:rPr>
-              <w:t>/api/trips/:tripCode</w:t>
-            </w:r>
+              <w:t>/</w:t>
+            </w:r>
+            <w:proofErr w:type="spellStart"/>
+            <w:r>
+              <w:rPr>
+                <w:rFonts w:asciiTheme="majorHAnsi" w:hAnsiTheme="majorHAnsi" w:cstheme="majorHAnsi"/>
+                <w:sz w:val="22"/>
+                <w:szCs w:val="22"/>
+              </w:rPr>
+              <w:t>api</w:t>
+            </w:r>
+            <w:proofErr w:type="spellEnd"/>
+            <w:r>
+              <w:rPr>
+                <w:rFonts w:asciiTheme="majorHAnsi" w:hAnsiTheme="majorHAnsi" w:cstheme="majorHAnsi"/>
+                <w:sz w:val="22"/>
+                <w:szCs w:val="22"/>
+              </w:rPr>
+              <w:t>/trips/:</w:t>
+            </w:r>
+            <w:proofErr w:type="spellStart"/>
+            <w:r>
+              <w:rPr>
+                <w:rFonts w:asciiTheme="majorHAnsi" w:hAnsiTheme="majorHAnsi" w:cstheme="majorHAnsi"/>
+                <w:sz w:val="22"/>
+                <w:szCs w:val="22"/>
+              </w:rPr>
+              <w:t>tripCode</w:t>
+            </w:r>
+            <w:proofErr w:type="spellEnd"/>
           </w:p>
         </w:tc>
         <w:tc>
@@ -3825,8 +4222,36 @@
                 <w:sz w:val="22"/>
                 <w:szCs w:val="22"/>
               </w:rPr>
-              <w:t>/api/trips/:tripCode</w:t>
-            </w:r>
+              <w:t>/</w:t>
+            </w:r>
+            <w:proofErr w:type="spellStart"/>
+            <w:r>
+              <w:rPr>
+                <w:rFonts w:asciiTheme="majorHAnsi" w:hAnsiTheme="majorHAnsi" w:cstheme="majorHAnsi"/>
+                <w:sz w:val="22"/>
+                <w:szCs w:val="22"/>
+              </w:rPr>
+              <w:t>api</w:t>
+            </w:r>
+            <w:proofErr w:type="spellEnd"/>
+            <w:r>
+              <w:rPr>
+                <w:rFonts w:asciiTheme="majorHAnsi" w:hAnsiTheme="majorHAnsi" w:cstheme="majorHAnsi"/>
+                <w:sz w:val="22"/>
+                <w:szCs w:val="22"/>
+              </w:rPr>
+              <w:t>/trips/:</w:t>
+            </w:r>
+            <w:proofErr w:type="spellStart"/>
+            <w:r>
+              <w:rPr>
+                <w:rFonts w:asciiTheme="majorHAnsi" w:hAnsiTheme="majorHAnsi" w:cstheme="majorHAnsi"/>
+                <w:sz w:val="22"/>
+                <w:szCs w:val="22"/>
+              </w:rPr>
+              <w:t>tripCode</w:t>
+            </w:r>
+            <w:proofErr w:type="spellEnd"/>
           </w:p>
         </w:tc>
         <w:tc>
@@ -3969,8 +4394,18 @@
                 <w:sz w:val="22"/>
                 <w:szCs w:val="22"/>
               </w:rPr>
-              <w:t>/api</w:t>
-            </w:r>
+              <w:t>/</w:t>
+            </w:r>
+            <w:proofErr w:type="spellStart"/>
+            <w:r>
+              <w:rPr>
+                <w:rFonts w:asciiTheme="majorHAnsi" w:hAnsiTheme="majorHAnsi" w:cstheme="majorHAnsi"/>
+                <w:sz w:val="22"/>
+                <w:szCs w:val="22"/>
+              </w:rPr>
+              <w:t>api</w:t>
+            </w:r>
+            <w:proofErr w:type="spellEnd"/>
             <w:r>
               <w:rPr>
                 <w:rFonts w:asciiTheme="majorHAnsi" w:hAnsiTheme="majorHAnsi" w:cstheme="majorHAnsi"/>
@@ -4035,6 +4470,39 @@
         </w:rPr>
       </w:pPr>
     </w:p>
+    <w:p>
+      <w:pPr>
+        <w:suppressAutoHyphens/>
+        <w:contextualSpacing/>
+        <w:rPr>
+          <w:rFonts w:asciiTheme="majorHAnsi" w:hAnsiTheme="majorHAnsi" w:cstheme="majorHAnsi"/>
+          <w:bCs/>
+          <w:sz w:val="22"/>
+          <w:szCs w:val="22"/>
+        </w:rPr>
+      </w:pPr>
+      <w:r>
+        <w:rPr>
+          <w:rFonts w:asciiTheme="majorHAnsi" w:hAnsiTheme="majorHAnsi" w:cstheme="majorHAnsi"/>
+          <w:bCs/>
+          <w:sz w:val="22"/>
+          <w:szCs w:val="22"/>
+        </w:rPr>
+        <w:t>All protected endpoints validate a JWT token using Express middleware. The token must be included in the Authorization header as a Bearer token to authorize data-modifying requests.</w:t>
+      </w:r>
+    </w:p>
+    <w:p>
+      <w:pPr>
+        <w:suppressAutoHyphens/>
+        <w:contextualSpacing/>
+        <w:rPr>
+          <w:rFonts w:asciiTheme="majorHAnsi" w:hAnsiTheme="majorHAnsi" w:cstheme="majorHAnsi"/>
+          <w:b/>
+          <w:sz w:val="22"/>
+          <w:szCs w:val="22"/>
+        </w:rPr>
+      </w:pPr>
+    </w:p>
     <w:bookmarkStart w:id="16" w:name="_heading=h.4h5b3qv007h8" w:colFirst="0" w:colLast="0"/>
     <w:bookmarkStart w:id="17" w:name="_Toc36198473"/>
     <w:bookmarkEnd w:id="16"/>
@@ -4055,7 +4523,6 @@
           <w:tag w:val="goog_rdk_0"/>
           <w:id w:val="218947832"/>
         </w:sdtPr>
-        <w:sdtEndPr/>
         <w:sdtContent/>
       </w:sdt>
       <w:r>
@@ -4081,6 +4548,43 @@
       <w:pPr>
         <w:suppressAutoHyphens/>
         <w:contextualSpacing/>
+        <w:rPr>
+          <w:rFonts w:asciiTheme="majorHAnsi" w:hAnsiTheme="majorHAnsi" w:cstheme="majorHAnsi"/>
+          <w:sz w:val="22"/>
+          <w:szCs w:val="22"/>
+        </w:rPr>
+      </w:pPr>
+      <w:r>
+        <w:rPr>
+          <w:rFonts w:asciiTheme="majorHAnsi" w:hAnsiTheme="majorHAnsi" w:cstheme="majorHAnsi"/>
+          <w:sz w:val="22"/>
+          <w:szCs w:val="22"/>
+        </w:rPr>
+        <w:t>The following screenshots demonstrate the functional Angular SPA and API testing for the Travlr Getaways admin application.</w:t>
+      </w:r>
+    </w:p>
+    <w:p>
+      <w:pPr>
+        <w:suppressAutoHyphens/>
+        <w:contextualSpacing/>
+        <w:rPr>
+          <w:rFonts w:asciiTheme="majorHAnsi" w:hAnsiTheme="majorHAnsi" w:cstheme="majorHAnsi"/>
+          <w:sz w:val="22"/>
+          <w:szCs w:val="22"/>
+        </w:rPr>
+      </w:pPr>
+    </w:p>
+    <w:p>
+      <w:pPr>
+        <w:suppressAutoHyphens/>
+        <w:contextualSpacing/>
+        <w:rPr>
+          <w:rFonts w:asciiTheme="majorHAnsi" w:hAnsiTheme="majorHAnsi" w:cstheme="majorHAnsi"/>
+          <w:sz w:val="22"/>
+          <w:szCs w:val="22"/>
+        </w:rPr>
+      </w:pPr>
+      <w:r>
         <w:rPr>
           <w:rFonts w:asciiTheme="majorHAnsi" w:hAnsiTheme="majorHAnsi" w:cstheme="majorHAnsi"/>
           <w:b/>
@@ -4090,125 +4594,634 @@
           <w:sz w:val="22"/>
           <w:szCs w:val="22"/>
         </w:rPr>
-      </w:pPr>
-      <w:r>
-        <w:rPr>
-          <w:rFonts w:asciiTheme="majorHAnsi" w:hAnsiTheme="majorHAnsi" w:cstheme="majorHAnsi"/>
-          <w:b/>
-          <w:bCs/>
-          <w:i/>
-          <w:iCs/>
-          <w:sz w:val="22"/>
-          <w:szCs w:val="22"/>
-        </w:rPr>
-        <w:t>*</w:t>
-      </w:r>
-      <w:r>
-        <w:rPr>
-          <w:rFonts w:asciiTheme="majorHAnsi" w:hAnsiTheme="majorHAnsi" w:cstheme="majorHAnsi"/>
-          <w:b/>
-          <w:bCs/>
-          <w:i/>
-          <w:iCs/>
-          <w:sz w:val="22"/>
-          <w:szCs w:val="22"/>
-        </w:rPr>
-        <w:t xml:space="preserve">Screenshots of the Angular SPA (trip creation, edit, and update </w:t>
-      </w:r>
-      <w:r>
-        <w:rPr>
-          <w:rFonts w:asciiTheme="majorHAnsi" w:hAnsiTheme="majorHAnsi" w:cstheme="majorHAnsi"/>
-          <w:b/>
-          <w:bCs/>
-          <w:i/>
-          <w:iCs/>
-          <w:sz w:val="22"/>
-          <w:szCs w:val="22"/>
-        </w:rPr>
-        <w:t>screens)</w:t>
-      </w:r>
-      <w:r>
-        <w:rPr>
-          <w:rFonts w:asciiTheme="majorHAnsi" w:hAnsiTheme="majorHAnsi" w:cstheme="majorHAnsi"/>
-          <w:b/>
-          <w:bCs/>
-          <w:i/>
-          <w:iCs/>
-          <w:sz w:val="22"/>
-          <w:szCs w:val="22"/>
-        </w:rPr>
-        <w:t xml:space="preserve"> *</w:t>
-      </w:r>
-      <w:r>
-        <w:rPr>
-          <w:rFonts w:asciiTheme="majorHAnsi" w:hAnsiTheme="majorHAnsi" w:cstheme="majorHAnsi"/>
-          <w:b/>
-          <w:bCs/>
-          <w:i/>
-          <w:iCs/>
-          <w:sz w:val="22"/>
-          <w:szCs w:val="22"/>
-        </w:rPr>
-        <w:t xml:space="preserve"> will be added in a later milestone once the admin interface is fully implemented.</w:t>
-      </w:r>
-    </w:p>
-    <w:p>
-      <w:pPr>
-        <w:suppressAutoHyphens/>
-        <w:contextualSpacing/>
-        <w:rPr>
-          <w:rFonts w:asciiTheme="majorHAnsi" w:hAnsiTheme="majorHAnsi" w:cstheme="majorHAnsi"/>
-          <w:sz w:val="22"/>
-          <w:szCs w:val="22"/>
-        </w:rPr>
-      </w:pPr>
-    </w:p>
-    <w:p>
-      <w:pPr>
-        <w:suppressAutoHyphens/>
-        <w:contextualSpacing/>
-        <w:rPr>
-          <w:rFonts w:asciiTheme="majorHAnsi" w:hAnsiTheme="majorHAnsi" w:cstheme="majorHAnsi"/>
-          <w:sz w:val="22"/>
-          <w:szCs w:val="22"/>
-        </w:rPr>
-      </w:pPr>
-      <w:r>
-        <w:rPr>
-          <w:rFonts w:asciiTheme="majorHAnsi" w:hAnsiTheme="majorHAnsi" w:cstheme="majorHAnsi"/>
-          <w:sz w:val="22"/>
-          <w:szCs w:val="22"/>
-        </w:rPr>
-        <w:t>The Angular project structure differs significantly from the Express structure. While Express follows a traditional MVC pattern with routes, controllers, and views organized in separate directories, Angular uses a component-based architecture where each feature is encapsulated in its own module with components, services, and templates. The Angular SPA resides in the app_admin folder with a src/app directory containing components like trip-listing, trip-card, add-trip, and edit-trip, along with services like trip-data.service for API communication.</w:t>
-      </w:r>
-    </w:p>
-    <w:p>
-      <w:pPr>
-        <w:suppressAutoHyphens/>
-        <w:contextualSpacing/>
-        <w:rPr>
-          <w:rFonts w:asciiTheme="majorHAnsi" w:hAnsiTheme="majorHAnsi" w:cstheme="majorHAnsi"/>
-          <w:sz w:val="22"/>
-          <w:szCs w:val="22"/>
-        </w:rPr>
-      </w:pPr>
-    </w:p>
-    <w:p>
-      <w:pPr>
-        <w:suppressAutoHyphens/>
-        <w:contextualSpacing/>
-        <w:rPr>
-          <w:rFonts w:asciiTheme="majorHAnsi" w:hAnsiTheme="majorHAnsi" w:cstheme="majorHAnsi"/>
-          <w:sz w:val="22"/>
-          <w:szCs w:val="22"/>
-        </w:rPr>
-      </w:pPr>
-      <w:r>
-        <w:rPr>
-          <w:rFonts w:asciiTheme="majorHAnsi" w:hAnsiTheme="majorHAnsi" w:cstheme="majorHAnsi"/>
-          <w:sz w:val="22"/>
-          <w:szCs w:val="22"/>
-        </w:rPr>
+        <w:drawing>
+          <wp:inline distT="0" distB="0" distL="0" distR="0" wp14:anchorId="4CC6A037" wp14:editId="00C3DCF0">
+            <wp:extent cx="5943600" cy="2146935"/>
+            <wp:effectExtent l="0" t="0" r="0" b="5715"/>
+            <wp:docPr id="204328619" name="Picture 1"/>
+            <wp:cNvGraphicFramePr>
+              <a:graphicFrameLocks xmlns:a="http://schemas.openxmlformats.org/drawingml/2006/main" noChangeAspect="1"/>
+            </wp:cNvGraphicFramePr>
+            <a:graphic xmlns:a="http://schemas.openxmlformats.org/drawingml/2006/main">
+              <a:graphicData uri="http://schemas.openxmlformats.org/drawingml/2006/picture">
+                <pic:pic xmlns:pic="http://schemas.openxmlformats.org/drawingml/2006/picture">
+                  <pic:nvPicPr>
+                    <pic:cNvPr id="204328619" name=""/>
+                    <pic:cNvPicPr/>
+                  </pic:nvPicPr>
+                  <pic:blipFill>
+                    <a:blip r:embed="rId16"/>
+                    <a:stretch>
+                      <a:fillRect/>
+                    </a:stretch>
+                  </pic:blipFill>
+                  <pic:spPr>
+                    <a:xfrm>
+                      <a:off x="0" y="0"/>
+                      <a:ext cx="5943600" cy="2146935"/>
+                    </a:xfrm>
+                    <a:prstGeom prst="rect">
+                      <a:avLst/>
+                    </a:prstGeom>
+                  </pic:spPr>
+                </pic:pic>
+              </a:graphicData>
+            </a:graphic>
+          </wp:inline>
+        </w:drawing>
+      </w:r>
+    </w:p>
+    <w:p>
+      <w:pPr>
+        <w:suppressAutoHyphens/>
+        <w:contextualSpacing/>
+        <w:rPr>
+          <w:rFonts w:asciiTheme="majorHAnsi" w:hAnsiTheme="majorHAnsi" w:cstheme="majorHAnsi"/>
+          <w:sz w:val="22"/>
+          <w:szCs w:val="22"/>
+        </w:rPr>
+      </w:pPr>
+      <w:r>
+        <w:rPr>
+          <w:rFonts w:asciiTheme="majorHAnsi" w:hAnsiTheme="majorHAnsi" w:cstheme="majorHAnsi"/>
+          <w:sz w:val="22"/>
+          <w:szCs w:val="22"/>
+        </w:rPr>
+        <w:t>Fig 1. Angular SPA Login page at localhost:4200/login showing email and password fields</w:t>
+      </w:r>
+    </w:p>
+    <w:p>
+      <w:pPr>
+        <w:suppressAutoHyphens/>
+        <w:contextualSpacing/>
+        <w:rPr>
+          <w:rFonts w:asciiTheme="majorHAnsi" w:hAnsiTheme="majorHAnsi" w:cstheme="majorHAnsi"/>
+          <w:sz w:val="22"/>
+          <w:szCs w:val="22"/>
+        </w:rPr>
+      </w:pPr>
+    </w:p>
+    <w:p>
+      <w:pPr>
+        <w:suppressAutoHyphens/>
+        <w:contextualSpacing/>
+        <w:rPr>
+          <w:rFonts w:asciiTheme="majorHAnsi" w:hAnsiTheme="majorHAnsi" w:cstheme="majorHAnsi"/>
+          <w:sz w:val="22"/>
+          <w:szCs w:val="22"/>
+        </w:rPr>
+      </w:pPr>
+      <w:r>
+        <w:rPr>
+          <w:rFonts w:asciiTheme="majorHAnsi" w:hAnsiTheme="majorHAnsi" w:cstheme="majorHAnsi"/>
+          <w:noProof/>
+          <w:sz w:val="22"/>
+          <w:szCs w:val="22"/>
+        </w:rPr>
+        <w:lastRenderedPageBreak/>
+        <w:drawing>
+          <wp:inline distT="0" distB="0" distL="0" distR="0" wp14:anchorId="68D868F9" wp14:editId="1018C577">
+            <wp:extent cx="5934075" cy="3000375"/>
+            <wp:effectExtent l="0" t="0" r="9525" b="9525"/>
+            <wp:docPr id="1256260528" name="Picture 1"/>
+            <wp:cNvGraphicFramePr>
+              <a:graphicFrameLocks xmlns:a="http://schemas.openxmlformats.org/drawingml/2006/main" noChangeAspect="1"/>
+            </wp:cNvGraphicFramePr>
+            <a:graphic xmlns:a="http://schemas.openxmlformats.org/drawingml/2006/main">
+              <a:graphicData uri="http://schemas.openxmlformats.org/drawingml/2006/picture">
+                <pic:pic xmlns:pic="http://schemas.openxmlformats.org/drawingml/2006/picture">
+                  <pic:nvPicPr>
+                    <pic:cNvPr id="0" name="Picture 1"/>
+                    <pic:cNvPicPr>
+                      <a:picLocks noChangeAspect="1" noChangeArrowheads="1"/>
+                    </pic:cNvPicPr>
+                  </pic:nvPicPr>
+                  <pic:blipFill>
+                    <a:blip r:embed="rId17" cstate="print">
+                      <a:extLst>
+                        <a:ext uri="{28A0092B-C50C-407E-A947-70E740481C1C}">
+                          <a14:useLocalDpi xmlns:a14="http://schemas.microsoft.com/office/drawing/2010/main" val="0"/>
+                        </a:ext>
+                      </a:extLst>
+                    </a:blip>
+                    <a:srcRect/>
+                    <a:stretch>
+                      <a:fillRect/>
+                    </a:stretch>
+                  </pic:blipFill>
+                  <pic:spPr bwMode="auto">
+                    <a:xfrm>
+                      <a:off x="0" y="0"/>
+                      <a:ext cx="5934075" cy="3000375"/>
+                    </a:xfrm>
+                    <a:prstGeom prst="rect">
+                      <a:avLst/>
+                    </a:prstGeom>
+                    <a:noFill/>
+                    <a:ln>
+                      <a:noFill/>
+                    </a:ln>
+                  </pic:spPr>
+                </pic:pic>
+              </a:graphicData>
+            </a:graphic>
+          </wp:inline>
+        </w:drawing>
+      </w:r>
+    </w:p>
+    <w:p>
+      <w:pPr>
+        <w:suppressAutoHyphens/>
+        <w:contextualSpacing/>
+        <w:rPr>
+          <w:rFonts w:asciiTheme="majorHAnsi" w:hAnsiTheme="majorHAnsi" w:cstheme="majorHAnsi"/>
+          <w:sz w:val="22"/>
+          <w:szCs w:val="22"/>
+        </w:rPr>
+      </w:pPr>
+    </w:p>
+    <w:p>
+      <w:pPr>
+        <w:suppressAutoHyphens/>
+        <w:contextualSpacing/>
+        <w:rPr>
+          <w:rFonts w:asciiTheme="majorHAnsi" w:hAnsiTheme="majorHAnsi" w:cstheme="majorHAnsi"/>
+          <w:sz w:val="22"/>
+          <w:szCs w:val="22"/>
+        </w:rPr>
+      </w:pPr>
+      <w:r>
+        <w:rPr>
+          <w:rFonts w:asciiTheme="majorHAnsi" w:hAnsiTheme="majorHAnsi" w:cstheme="majorHAnsi"/>
+          <w:sz w:val="22"/>
+          <w:szCs w:val="22"/>
+        </w:rPr>
+        <w:t>Fig 2. Angular SPA Trip Listing page showing trip cards with Edit Trip buttons</w:t>
+      </w:r>
+    </w:p>
+    <w:p>
+      <w:pPr>
+        <w:suppressAutoHyphens/>
+        <w:contextualSpacing/>
+        <w:rPr>
+          <w:rFonts w:asciiTheme="majorHAnsi" w:hAnsiTheme="majorHAnsi" w:cstheme="majorHAnsi"/>
+          <w:sz w:val="22"/>
+          <w:szCs w:val="22"/>
+        </w:rPr>
+      </w:pPr>
+    </w:p>
+    <w:p>
+      <w:pPr>
+        <w:suppressAutoHyphens/>
+        <w:contextualSpacing/>
+        <w:rPr>
+          <w:rFonts w:asciiTheme="majorHAnsi" w:hAnsiTheme="majorHAnsi" w:cstheme="majorHAnsi"/>
+          <w:sz w:val="22"/>
+          <w:szCs w:val="22"/>
+        </w:rPr>
+      </w:pPr>
+      <w:r>
+        <w:rPr>
+          <w:rFonts w:asciiTheme="majorHAnsi" w:hAnsiTheme="majorHAnsi" w:cstheme="majorHAnsi"/>
+          <w:noProof/>
+          <w:sz w:val="22"/>
+          <w:szCs w:val="22"/>
+        </w:rPr>
+        <w:drawing>
+          <wp:inline distT="0" distB="0" distL="0" distR="0" wp14:anchorId="6C890F1F" wp14:editId="480AC48A">
+            <wp:extent cx="5943600" cy="3133725"/>
+            <wp:effectExtent l="0" t="0" r="0" b="9525"/>
+            <wp:docPr id="2015868168" name="Picture 2"/>
+            <wp:cNvGraphicFramePr>
+              <a:graphicFrameLocks xmlns:a="http://schemas.openxmlformats.org/drawingml/2006/main" noChangeAspect="1"/>
+            </wp:cNvGraphicFramePr>
+            <a:graphic xmlns:a="http://schemas.openxmlformats.org/drawingml/2006/main">
+              <a:graphicData uri="http://schemas.openxmlformats.org/drawingml/2006/picture">
+                <pic:pic xmlns:pic="http://schemas.openxmlformats.org/drawingml/2006/picture">
+                  <pic:nvPicPr>
+                    <pic:cNvPr id="0" name="Picture 2"/>
+                    <pic:cNvPicPr>
+                      <a:picLocks noChangeAspect="1" noChangeArrowheads="1"/>
+                    </pic:cNvPicPr>
+                  </pic:nvPicPr>
+                  <pic:blipFill>
+                    <a:blip r:embed="rId18" cstate="print">
+                      <a:extLst>
+                        <a:ext uri="{28A0092B-C50C-407E-A947-70E740481C1C}">
+                          <a14:useLocalDpi xmlns:a14="http://schemas.microsoft.com/office/drawing/2010/main" val="0"/>
+                        </a:ext>
+                      </a:extLst>
+                    </a:blip>
+                    <a:srcRect/>
+                    <a:stretch>
+                      <a:fillRect/>
+                    </a:stretch>
+                  </pic:blipFill>
+                  <pic:spPr bwMode="auto">
+                    <a:xfrm>
+                      <a:off x="0" y="0"/>
+                      <a:ext cx="5943600" cy="3133725"/>
+                    </a:xfrm>
+                    <a:prstGeom prst="rect">
+                      <a:avLst/>
+                    </a:prstGeom>
+                    <a:noFill/>
+                    <a:ln>
+                      <a:noFill/>
+                    </a:ln>
+                  </pic:spPr>
+                </pic:pic>
+              </a:graphicData>
+            </a:graphic>
+          </wp:inline>
+        </w:drawing>
+      </w:r>
+    </w:p>
+    <w:p>
+      <w:pPr>
+        <w:suppressAutoHyphens/>
+        <w:contextualSpacing/>
+        <w:rPr>
+          <w:rFonts w:asciiTheme="majorHAnsi" w:hAnsiTheme="majorHAnsi" w:cstheme="majorHAnsi"/>
+          <w:sz w:val="22"/>
+          <w:szCs w:val="22"/>
+        </w:rPr>
+      </w:pPr>
+    </w:p>
+    <w:p>
+      <w:pPr>
+        <w:suppressAutoHyphens/>
+        <w:contextualSpacing/>
+        <w:rPr>
+          <w:rFonts w:asciiTheme="majorHAnsi" w:hAnsiTheme="majorHAnsi" w:cstheme="majorHAnsi"/>
+          <w:sz w:val="22"/>
+          <w:szCs w:val="22"/>
+        </w:rPr>
+      </w:pPr>
+      <w:r>
+        <w:rPr>
+          <w:rFonts w:asciiTheme="majorHAnsi" w:hAnsiTheme="majorHAnsi" w:cstheme="majorHAnsi"/>
+          <w:sz w:val="22"/>
+          <w:szCs w:val="22"/>
+        </w:rPr>
+        <w:t>Fig 3. Angular SPA Edit Trip form loaded with existing trip data</w:t>
+      </w:r>
+    </w:p>
+    <w:p>
+      <w:pPr>
+        <w:suppressAutoHyphens/>
+        <w:contextualSpacing/>
+        <w:rPr>
+          <w:rFonts w:asciiTheme="majorHAnsi" w:hAnsiTheme="majorHAnsi" w:cstheme="majorHAnsi"/>
+          <w:sz w:val="22"/>
+          <w:szCs w:val="22"/>
+        </w:rPr>
+      </w:pPr>
+    </w:p>
+    <w:p>
+      <w:pPr>
+        <w:suppressAutoHyphens/>
+        <w:contextualSpacing/>
+        <w:rPr>
+          <w:rFonts w:asciiTheme="majorHAnsi" w:hAnsiTheme="majorHAnsi" w:cstheme="majorHAnsi"/>
+          <w:sz w:val="22"/>
+          <w:szCs w:val="22"/>
+        </w:rPr>
+      </w:pPr>
+      <w:r>
+        <w:rPr>
+          <w:rFonts w:asciiTheme="majorHAnsi" w:hAnsiTheme="majorHAnsi" w:cstheme="majorHAnsi"/>
+          <w:noProof/>
+          <w:sz w:val="22"/>
+          <w:szCs w:val="22"/>
+        </w:rPr>
+        <w:lastRenderedPageBreak/>
+        <w:drawing>
+          <wp:inline distT="0" distB="0" distL="0" distR="0" wp14:anchorId="66820AA8" wp14:editId="4EA33840">
+            <wp:extent cx="5934075" cy="2990850"/>
+            <wp:effectExtent l="0" t="0" r="9525" b="0"/>
+            <wp:docPr id="1911266293" name="Picture 3"/>
+            <wp:cNvGraphicFramePr>
+              <a:graphicFrameLocks xmlns:a="http://schemas.openxmlformats.org/drawingml/2006/main" noChangeAspect="1"/>
+            </wp:cNvGraphicFramePr>
+            <a:graphic xmlns:a="http://schemas.openxmlformats.org/drawingml/2006/main">
+              <a:graphicData uri="http://schemas.openxmlformats.org/drawingml/2006/picture">
+                <pic:pic xmlns:pic="http://schemas.openxmlformats.org/drawingml/2006/picture">
+                  <pic:nvPicPr>
+                    <pic:cNvPr id="0" name="Picture 3"/>
+                    <pic:cNvPicPr>
+                      <a:picLocks noChangeAspect="1" noChangeArrowheads="1"/>
+                    </pic:cNvPicPr>
+                  </pic:nvPicPr>
+                  <pic:blipFill>
+                    <a:blip r:embed="rId19" cstate="print">
+                      <a:extLst>
+                        <a:ext uri="{28A0092B-C50C-407E-A947-70E740481C1C}">
+                          <a14:useLocalDpi xmlns:a14="http://schemas.microsoft.com/office/drawing/2010/main" val="0"/>
+                        </a:ext>
+                      </a:extLst>
+                    </a:blip>
+                    <a:srcRect/>
+                    <a:stretch>
+                      <a:fillRect/>
+                    </a:stretch>
+                  </pic:blipFill>
+                  <pic:spPr bwMode="auto">
+                    <a:xfrm>
+                      <a:off x="0" y="0"/>
+                      <a:ext cx="5934075" cy="2990850"/>
+                    </a:xfrm>
+                    <a:prstGeom prst="rect">
+                      <a:avLst/>
+                    </a:prstGeom>
+                    <a:noFill/>
+                    <a:ln>
+                      <a:noFill/>
+                    </a:ln>
+                  </pic:spPr>
+                </pic:pic>
+              </a:graphicData>
+            </a:graphic>
+          </wp:inline>
+        </w:drawing>
+      </w:r>
+    </w:p>
+    <w:p>
+      <w:pPr>
+        <w:suppressAutoHyphens/>
+        <w:contextualSpacing/>
+        <w:rPr>
+          <w:rFonts w:asciiTheme="majorHAnsi" w:hAnsiTheme="majorHAnsi" w:cstheme="majorHAnsi"/>
+          <w:sz w:val="22"/>
+          <w:szCs w:val="22"/>
+        </w:rPr>
+      </w:pPr>
+    </w:p>
+    <w:p>
+      <w:pPr>
+        <w:suppressAutoHyphens/>
+        <w:contextualSpacing/>
+        <w:rPr>
+          <w:rFonts w:asciiTheme="majorHAnsi" w:hAnsiTheme="majorHAnsi" w:cstheme="majorHAnsi"/>
+          <w:sz w:val="22"/>
+          <w:szCs w:val="22"/>
+        </w:rPr>
+      </w:pPr>
+      <w:r>
+        <w:rPr>
+          <w:rFonts w:asciiTheme="majorHAnsi" w:hAnsiTheme="majorHAnsi" w:cstheme="majorHAnsi"/>
+          <w:sz w:val="22"/>
+          <w:szCs w:val="22"/>
+        </w:rPr>
+        <w:t>Fig 4. Trip Listing after successful PUT update showing updated price</w:t>
+      </w:r>
+    </w:p>
+    <w:p>
+      <w:pPr>
+        <w:suppressAutoHyphens/>
+        <w:contextualSpacing/>
+        <w:rPr>
+          <w:rFonts w:asciiTheme="majorHAnsi" w:hAnsiTheme="majorHAnsi" w:cstheme="majorHAnsi"/>
+          <w:sz w:val="22"/>
+          <w:szCs w:val="22"/>
+        </w:rPr>
+      </w:pPr>
+    </w:p>
+    <w:p>
+      <w:pPr>
+        <w:suppressAutoHyphens/>
+        <w:contextualSpacing/>
+        <w:rPr>
+          <w:rFonts w:asciiTheme="majorHAnsi" w:hAnsiTheme="majorHAnsi" w:cstheme="majorHAnsi"/>
+          <w:sz w:val="22"/>
+          <w:szCs w:val="22"/>
+        </w:rPr>
+      </w:pPr>
+      <w:r>
+        <w:rPr>
+          <w:rFonts w:asciiTheme="majorHAnsi" w:hAnsiTheme="majorHAnsi" w:cstheme="majorHAnsi"/>
+          <w:noProof/>
+          <w:sz w:val="22"/>
+          <w:szCs w:val="22"/>
+        </w:rPr>
+        <w:drawing>
+          <wp:inline distT="0" distB="0" distL="0" distR="0" wp14:anchorId="2A960E00" wp14:editId="369DCCE0">
+            <wp:extent cx="5934075" cy="2847975"/>
+            <wp:effectExtent l="0" t="0" r="9525" b="9525"/>
+            <wp:docPr id="165496400" name="Picture 4"/>
+            <wp:cNvGraphicFramePr>
+              <a:graphicFrameLocks xmlns:a="http://schemas.openxmlformats.org/drawingml/2006/main" noChangeAspect="1"/>
+            </wp:cNvGraphicFramePr>
+            <a:graphic xmlns:a="http://schemas.openxmlformats.org/drawingml/2006/main">
+              <a:graphicData uri="http://schemas.openxmlformats.org/drawingml/2006/picture">
+                <pic:pic xmlns:pic="http://schemas.openxmlformats.org/drawingml/2006/picture">
+                  <pic:nvPicPr>
+                    <pic:cNvPr id="0" name="Picture 4"/>
+                    <pic:cNvPicPr>
+                      <a:picLocks noChangeAspect="1" noChangeArrowheads="1"/>
+                    </pic:cNvPicPr>
+                  </pic:nvPicPr>
+                  <pic:blipFill>
+                    <a:blip r:embed="rId20" cstate="print">
+                      <a:extLst>
+                        <a:ext uri="{28A0092B-C50C-407E-A947-70E740481C1C}">
+                          <a14:useLocalDpi xmlns:a14="http://schemas.microsoft.com/office/drawing/2010/main" val="0"/>
+                        </a:ext>
+                      </a:extLst>
+                    </a:blip>
+                    <a:srcRect/>
+                    <a:stretch>
+                      <a:fillRect/>
+                    </a:stretch>
+                  </pic:blipFill>
+                  <pic:spPr bwMode="auto">
+                    <a:xfrm>
+                      <a:off x="0" y="0"/>
+                      <a:ext cx="5934075" cy="2847975"/>
+                    </a:xfrm>
+                    <a:prstGeom prst="rect">
+                      <a:avLst/>
+                    </a:prstGeom>
+                    <a:noFill/>
+                    <a:ln>
+                      <a:noFill/>
+                    </a:ln>
+                  </pic:spPr>
+                </pic:pic>
+              </a:graphicData>
+            </a:graphic>
+          </wp:inline>
+        </w:drawing>
+      </w:r>
+    </w:p>
+    <w:p>
+      <w:pPr>
+        <w:suppressAutoHyphens/>
+        <w:contextualSpacing/>
+        <w:rPr>
+          <w:rFonts w:asciiTheme="majorHAnsi" w:hAnsiTheme="majorHAnsi" w:cstheme="majorHAnsi"/>
+          <w:sz w:val="22"/>
+          <w:szCs w:val="22"/>
+        </w:rPr>
+      </w:pPr>
+    </w:p>
+    <w:p>
+      <w:pPr>
+        <w:suppressAutoHyphens/>
+        <w:contextualSpacing/>
+        <w:rPr>
+          <w:rFonts w:asciiTheme="majorHAnsi" w:hAnsiTheme="majorHAnsi" w:cstheme="majorHAnsi"/>
+          <w:sz w:val="22"/>
+          <w:szCs w:val="22"/>
+        </w:rPr>
+      </w:pPr>
+      <w:r>
+        <w:rPr>
+          <w:rFonts w:asciiTheme="majorHAnsi" w:hAnsiTheme="majorHAnsi" w:cstheme="majorHAnsi"/>
+          <w:sz w:val="22"/>
+          <w:szCs w:val="22"/>
+        </w:rPr>
+        <w:t>Fig 5. Postman API test – POST /</w:t>
+      </w:r>
+      <w:proofErr w:type="spellStart"/>
+      <w:r>
+        <w:rPr>
+          <w:rFonts w:asciiTheme="majorHAnsi" w:hAnsiTheme="majorHAnsi" w:cstheme="majorHAnsi"/>
+          <w:sz w:val="22"/>
+          <w:szCs w:val="22"/>
+        </w:rPr>
+        <w:t>api</w:t>
+      </w:r>
+      <w:proofErr w:type="spellEnd"/>
+      <w:r>
+        <w:rPr>
+          <w:rFonts w:asciiTheme="majorHAnsi" w:hAnsiTheme="majorHAnsi" w:cstheme="majorHAnsi"/>
+          <w:sz w:val="22"/>
+          <w:szCs w:val="22"/>
+        </w:rPr>
+        <w:t>/login returning 200</w:t>
+      </w:r>
+      <w:r>
+        <w:rPr>
+          <w:rFonts w:asciiTheme="majorHAnsi" w:hAnsiTheme="majorHAnsi" w:cstheme="majorHAnsi"/>
+          <w:sz w:val="22"/>
+          <w:szCs w:val="22"/>
+        </w:rPr>
+        <w:t xml:space="preserve"> OK JWT token</w:t>
+      </w:r>
+    </w:p>
+    <w:p>
+      <w:pPr>
+        <w:suppressAutoHyphens/>
+        <w:contextualSpacing/>
+        <w:rPr>
+          <w:rFonts w:asciiTheme="majorHAnsi" w:hAnsiTheme="majorHAnsi" w:cstheme="majorHAnsi"/>
+          <w:sz w:val="22"/>
+          <w:szCs w:val="22"/>
+        </w:rPr>
+      </w:pPr>
+    </w:p>
+    <w:p>
+      <w:pPr>
+        <w:suppressAutoHyphens/>
+        <w:contextualSpacing/>
+        <w:rPr>
+          <w:rFonts w:asciiTheme="majorHAnsi" w:hAnsiTheme="majorHAnsi" w:cstheme="majorHAnsi"/>
+          <w:sz w:val="22"/>
+          <w:szCs w:val="22"/>
+        </w:rPr>
+      </w:pPr>
+      <w:r>
+        <w:rPr>
+          <w:rFonts w:asciiTheme="majorHAnsi" w:hAnsiTheme="majorHAnsi" w:cstheme="majorHAnsi"/>
+          <w:sz w:val="22"/>
+          <w:szCs w:val="22"/>
+        </w:rPr>
+        <w:t xml:space="preserve">The Angular project structure differs significantly from the Express structure. While Express follows a traditional MVC pattern with routes, controllers, and views organized in separate directories, Angular uses a component-based architecture where each feature is encapsulated in its own module with components, services, and templates. The Angular SPA resides in the </w:t>
+      </w:r>
+      <w:proofErr w:type="spellStart"/>
+      <w:r>
+        <w:rPr>
+          <w:rFonts w:asciiTheme="majorHAnsi" w:hAnsiTheme="majorHAnsi" w:cstheme="majorHAnsi"/>
+          <w:sz w:val="22"/>
+          <w:szCs w:val="22"/>
+        </w:rPr>
+        <w:t>app_admin</w:t>
+      </w:r>
+      <w:proofErr w:type="spellEnd"/>
+      <w:r>
+        <w:rPr>
+          <w:rFonts w:asciiTheme="majorHAnsi" w:hAnsiTheme="majorHAnsi" w:cstheme="majorHAnsi"/>
+          <w:sz w:val="22"/>
+          <w:szCs w:val="22"/>
+        </w:rPr>
+        <w:t xml:space="preserve"> folder with a </w:t>
+      </w:r>
+      <w:proofErr w:type="spellStart"/>
+      <w:r>
+        <w:rPr>
+          <w:rFonts w:asciiTheme="majorHAnsi" w:hAnsiTheme="majorHAnsi" w:cstheme="majorHAnsi"/>
+          <w:sz w:val="22"/>
+          <w:szCs w:val="22"/>
+        </w:rPr>
+        <w:t>src</w:t>
+      </w:r>
+      <w:proofErr w:type="spellEnd"/>
+      <w:r>
+        <w:rPr>
+          <w:rFonts w:asciiTheme="majorHAnsi" w:hAnsiTheme="majorHAnsi" w:cstheme="majorHAnsi"/>
+          <w:sz w:val="22"/>
+          <w:szCs w:val="22"/>
+        </w:rPr>
+        <w:t>/app directory containing components like trip-listing, trip-card, add-trip, and edit-trip, along with services like trip-</w:t>
+      </w:r>
+      <w:proofErr w:type="spellStart"/>
+      <w:r>
+        <w:rPr>
+          <w:rFonts w:asciiTheme="majorHAnsi" w:hAnsiTheme="majorHAnsi" w:cstheme="majorHAnsi"/>
+          <w:sz w:val="22"/>
+          <w:szCs w:val="22"/>
+        </w:rPr>
+        <w:t>data.service</w:t>
+      </w:r>
+      <w:proofErr w:type="spellEnd"/>
+      <w:r>
+        <w:rPr>
+          <w:rFonts w:asciiTheme="majorHAnsi" w:hAnsiTheme="majorHAnsi" w:cstheme="majorHAnsi"/>
+          <w:sz w:val="22"/>
+          <w:szCs w:val="22"/>
+        </w:rPr>
+        <w:t xml:space="preserve"> for API communication.</w:t>
+      </w:r>
+    </w:p>
+    <w:p>
+      <w:pPr>
+        <w:suppressAutoHyphens/>
+        <w:contextualSpacing/>
+        <w:rPr>
+          <w:rFonts w:asciiTheme="majorHAnsi" w:hAnsiTheme="majorHAnsi" w:cstheme="majorHAnsi"/>
+          <w:sz w:val="22"/>
+          <w:szCs w:val="22"/>
+        </w:rPr>
+      </w:pPr>
+    </w:p>
+    <w:p>
+      <w:pPr>
+        <w:suppressAutoHyphens/>
+        <w:contextualSpacing/>
+        <w:rPr>
+          <w:rFonts w:asciiTheme="majorHAnsi" w:hAnsiTheme="majorHAnsi" w:cstheme="majorHAnsi"/>
+          <w:sz w:val="22"/>
+          <w:szCs w:val="22"/>
+        </w:rPr>
+      </w:pPr>
+      <w:r>
+        <w:rPr>
+          <w:rFonts w:asciiTheme="majorHAnsi" w:hAnsiTheme="majorHAnsi" w:cstheme="majorHAnsi"/>
+          <w:sz w:val="22"/>
+          <w:szCs w:val="22"/>
+        </w:rPr>
+        <w:lastRenderedPageBreak/>
         <w:t>The SPA provides significantly richer functionality than traditional web applications. Rather than full page reloads, Angular updates only the necessary portions of the DOM, creating a fluid, desktop-like experience. The SPA maintains application state in memory, enabling instant navigation between views and real-time form validation. Two-way data binding automatically synchronizes the model and view, so changes in form inputs immediately reflect in the component’s data model and vice versa. This reactive approach eliminates the need for manual DOM manipulation and provides immediate user feedback.</w:t>
       </w:r>
     </w:p>
@@ -4239,7 +5252,25 @@
           <w:sz w:val="22"/>
           <w:szCs w:val="22"/>
         </w:rPr>
-        <w:t xml:space="preserve">Testing the SPA involves multiple approaches. During development, browser developer tools monitor network requests to verify correct API endpoints are being called with proper HTTP methods and payloads. The Network tab shows GET requests to /api/trips returning trip </w:t>
+        <w:t>Testing the SPA involves multiple approaches. During development, browser developer tools monitor network requests to verify correct API endpoints are being called with proper HTTP methods and payloads. The Network tab shows GET requests to /</w:t>
+      </w:r>
+      <w:proofErr w:type="spellStart"/>
+      <w:r>
+        <w:rPr>
+          <w:rFonts w:asciiTheme="majorHAnsi" w:hAnsiTheme="majorHAnsi" w:cstheme="majorHAnsi"/>
+          <w:sz w:val="22"/>
+          <w:szCs w:val="22"/>
+        </w:rPr>
+        <w:t>api</w:t>
+      </w:r>
+      <w:proofErr w:type="spellEnd"/>
+      <w:r>
+        <w:rPr>
+          <w:rFonts w:asciiTheme="majorHAnsi" w:hAnsiTheme="majorHAnsi" w:cstheme="majorHAnsi"/>
+          <w:sz w:val="22"/>
+          <w:szCs w:val="22"/>
+        </w:rPr>
+        <w:t xml:space="preserve">/trips returning trip </w:t>
       </w:r>
       <w:r>
         <w:rPr>
@@ -4255,21 +5286,95 @@
           <w:sz w:val="22"/>
           <w:szCs w:val="22"/>
         </w:rPr>
-        <w:t xml:space="preserve"> PUT requests to </w:t>
-      </w:r>
-      <w:r>
-        <w:rPr>
-          <w:rFonts w:asciiTheme="majorHAnsi" w:hAnsiTheme="majorHAnsi" w:cstheme="majorHAnsi"/>
-          <w:sz w:val="22"/>
-          <w:szCs w:val="22"/>
-        </w:rPr>
-        <w:lastRenderedPageBreak/>
-        <w:t>/api/trips/:tripCode sending updated trip data. Angular’s development server provides live reload, allowing immediate verification of changes. For systematic testing, developers can use Angular’s built-in testing framework with Jasmine and Karma to write unit tests for components and services. Integration testing verifies that clicking “Edit” loads trip data into the form, modifying fields updates the model, and submitting sends the correct PUT request. Successful API communication is confirmed when the database reflects changes and the UI updates accordingly without page refreshes.</w:t>
-      </w:r>
+        <w:t xml:space="preserve"> PUT requests to /</w:t>
+      </w:r>
+      <w:proofErr w:type="spellStart"/>
+      <w:r>
+        <w:rPr>
+          <w:rFonts w:asciiTheme="majorHAnsi" w:hAnsiTheme="majorHAnsi" w:cstheme="majorHAnsi"/>
+          <w:sz w:val="22"/>
+          <w:szCs w:val="22"/>
+        </w:rPr>
+        <w:t>api</w:t>
+      </w:r>
+      <w:proofErr w:type="spellEnd"/>
+      <w:r>
+        <w:rPr>
+          <w:rFonts w:asciiTheme="majorHAnsi" w:hAnsiTheme="majorHAnsi" w:cstheme="majorHAnsi"/>
+          <w:sz w:val="22"/>
+          <w:szCs w:val="22"/>
+        </w:rPr>
+        <w:t>/trips/:</w:t>
+      </w:r>
+      <w:proofErr w:type="spellStart"/>
+      <w:r>
+        <w:rPr>
+          <w:rFonts w:asciiTheme="majorHAnsi" w:hAnsiTheme="majorHAnsi" w:cstheme="majorHAnsi"/>
+          <w:sz w:val="22"/>
+          <w:szCs w:val="22"/>
+        </w:rPr>
+        <w:t>tripCode</w:t>
+      </w:r>
+      <w:proofErr w:type="spellEnd"/>
+      <w:r>
+        <w:rPr>
+          <w:rFonts w:asciiTheme="majorHAnsi" w:hAnsiTheme="majorHAnsi" w:cstheme="majorHAnsi"/>
+          <w:sz w:val="22"/>
+          <w:szCs w:val="22"/>
+        </w:rPr>
+        <w:t xml:space="preserve"> sending updated trip data. </w:t>
+      </w:r>
+      <w:proofErr w:type="spellStart"/>
+      <w:r>
+        <w:rPr>
+          <w:rFonts w:asciiTheme="majorHAnsi" w:hAnsiTheme="majorHAnsi" w:cstheme="majorHAnsi"/>
+          <w:sz w:val="22"/>
+          <w:szCs w:val="22"/>
+        </w:rPr>
+        <w:t>Angular’s</w:t>
+      </w:r>
+      <w:proofErr w:type="spellEnd"/>
+      <w:r>
+        <w:rPr>
+          <w:rFonts w:asciiTheme="majorHAnsi" w:hAnsiTheme="majorHAnsi" w:cstheme="majorHAnsi"/>
+          <w:sz w:val="22"/>
+          <w:szCs w:val="22"/>
+        </w:rPr>
+        <w:t xml:space="preserve"> development server provides live reload, allowing immediate verification of changes. For systematic testing, developers can use </w:t>
+      </w:r>
+      <w:proofErr w:type="spellStart"/>
+      <w:r>
+        <w:rPr>
+          <w:rFonts w:asciiTheme="majorHAnsi" w:hAnsiTheme="majorHAnsi" w:cstheme="majorHAnsi"/>
+          <w:sz w:val="22"/>
+          <w:szCs w:val="22"/>
+        </w:rPr>
+        <w:t>Angular’s</w:t>
+      </w:r>
+      <w:proofErr w:type="spellEnd"/>
+      <w:r>
+        <w:rPr>
+          <w:rFonts w:asciiTheme="majorHAnsi" w:hAnsiTheme="majorHAnsi" w:cstheme="majorHAnsi"/>
+          <w:sz w:val="22"/>
+          <w:szCs w:val="22"/>
+        </w:rPr>
+        <w:t xml:space="preserve"> built-in testing framework with Jasmine and Karma to write unit tests for components and services. Integration testing verifies that clicking “Edit” loads trip data into the form, modifying fields updates the model, and submitting sends the correct PUT request. Successful API communication is confirmed when the database reflects changes and the UI updates accordingly without page refreshes.</w:t>
+      </w:r>
+    </w:p>
+    <w:p>
+      <w:pPr>
+        <w:suppressAutoHyphens/>
+        <w:contextualSpacing/>
+        <w:rPr>
+          <w:rFonts w:asciiTheme="majorHAnsi" w:hAnsiTheme="majorHAnsi" w:cstheme="majorHAnsi"/>
+          <w:sz w:val="22"/>
+          <w:szCs w:val="22"/>
+        </w:rPr>
+      </w:pPr>
     </w:p>
     <w:sectPr>
-      <w:footerReference w:type="even" r:id="rId16"/>
-      <w:footerReference w:type="default" r:id="rId17"/>
+      <w:footerReference w:type="even" r:id="rId21"/>
+      <w:footerReference w:type="default" r:id="rId22"/>
       <w:pgSz w:w="12240" w:h="15840"/>
       <w:pgMar w:top="1440" w:right="1440" w:bottom="1440" w:left="1440" w:header="720" w:footer="720" w:gutter="0"/>
       <w:pgNumType w:start="1"/>
@@ -5099,7 +6204,6 @@
   <w:style w:type="character" w:default="1" w:styleId="DefaultParagraphFont">
     <w:name w:val="Default Paragraph Font"/>
     <w:uiPriority w:val="1"/>
-    <w:semiHidden/>
     <w:unhideWhenUsed/>
   </w:style>
   <w:style w:type="table" w:default="1" w:styleId="TableNormal">
@@ -5748,18 +6852,6 @@
 </file>
 
 <file path=customXml/item2.xml><?xml version="1.0" encoding="utf-8"?>
-<go:gDocsCustomXmlDataStorage xmlns:r="http://schemas.openxmlformats.org/officeDocument/2006/relationships" xmlns:go="http://customooxmlschemas.google.com/">
-  <go:docsCustomData xmlns:go="http://customooxmlschemas.google.com/" roundtripDataSignature="AMtx7mhlQxUlYotSxlzb/K+26fkCr5Qlkw==">AMUW2mW1kN5agRxwVIWyD/m6beqkmXuOJ9L+jXyq6OrT8A7uOkGRZeTuNxoWv36g8BJCXl4uefNfMOi9mZH/d1SUUadKtuTNwxRVRTTjHLfUoJAQulT1ojg=</go:docsCustomData>
-</go:gDocsCustomXmlDataStorage>
-</file>
-
-<file path=customXml/item3.xml><?xml version="1.0" encoding="utf-8"?>
-<p:properties xmlns:p="http://schemas.microsoft.com/office/2006/metadata/properties" xmlns:xsi="http://www.w3.org/2001/XMLSchema-instance" xmlns:pc="http://schemas.microsoft.com/office/infopath/2007/PartnerControls">
-  <documentManagement/>
-</p:properties>
-</file>
-
-<file path=customXml/item4.xml><?xml version="1.0" encoding="utf-8"?>
 <ct:contentTypeSchema xmlns:ct="http://schemas.microsoft.com/office/2006/metadata/contentType" xmlns:ma="http://schemas.microsoft.com/office/2006/metadata/properties/metaAttributes" ct:_="" ma:_="" ma:contentTypeName="Document" ma:contentTypeID="0x01010019267F6D1A260A4394C18F5AF72445EA" ma:contentTypeVersion="3" ma:contentTypeDescription="Create a new document." ma:contentTypeScope="" ma:versionID="d6a723735a0ade9a92961b83aee31dda">
   <xsd:schema xmlns:xsd="http://www.w3.org/2001/XMLSchema" xmlns:xs="http://www.w3.org/2001/XMLSchema" xmlns:p="http://schemas.microsoft.com/office/2006/metadata/properties" targetNamespace="http://schemas.microsoft.com/office/2006/metadata/properties" ma:root="true" ma:fieldsID="e345bd7673956a623930e5662e321f3a">
     <xsd:element name="properties">
@@ -5873,6 +6965,18 @@
 </ct:contentTypeSchema>
 </file>
 
+<file path=customXml/item3.xml><?xml version="1.0" encoding="utf-8"?>
+<p:properties xmlns:p="http://schemas.microsoft.com/office/2006/metadata/properties" xmlns:xsi="http://www.w3.org/2001/XMLSchema-instance" xmlns:pc="http://schemas.microsoft.com/office/infopath/2007/PartnerControls">
+  <documentManagement/>
+</p:properties>
+</file>
+
+<file path=customXml/item4.xml><?xml version="1.0" encoding="utf-8"?>
+<go:gDocsCustomXmlDataStorage xmlns:r="http://schemas.openxmlformats.org/officeDocument/2006/relationships" xmlns:go="http://customooxmlschemas.google.com/">
+  <go:docsCustomData xmlns:go="http://customooxmlschemas.google.com/" roundtripDataSignature="AMtx7mhlQxUlYotSxlzb/K+26fkCr5Qlkw==">AMUW2mW1kN5agRxwVIWyD/m6beqkmXuOJ9L+jXyq6OrT8A7uOkGRZeTuNxoWv36g8BJCXl4uefNfMOi9mZH/d1SUUadKtuTNwxRVRTTjHLfUoJAQulT1ojg=</go:docsCustomData>
+</go:gDocsCustomXmlDataStorage>
+</file>
+
 <file path=customXml/itemProps1.xml><?xml version="1.0" encoding="utf-8"?>
 <ds:datastoreItem xmlns:ds="http://schemas.openxmlformats.org/officeDocument/2006/customXml" ds:itemID="{DFAA2243-9B12-47D3-B8CD-149B296ED07C}">
   <ds:schemaRefs>
@@ -5882,10 +6986,17 @@
 </file>
 
 <file path=customXml/itemProps2.xml><?xml version="1.0" encoding="utf-8"?>
-<ds:datastoreItem xmlns:ds="http://schemas.openxmlformats.org/officeDocument/2006/customXml" ds:itemID="{11111111-1234-1234-1234-123412341234}">
+<ds:datastoreItem xmlns:ds="http://schemas.openxmlformats.org/officeDocument/2006/customXml" ds:itemID="{0B67D417-F46B-459B-BE4A-CE060E0409B1}">
   <ds:schemaRefs>
-    <ds:schemaRef ds:uri="http://schemas.openxmlformats.org/officeDocument/2006/relationships"/>
-    <ds:schemaRef ds:uri="http://customooxmlschemas.google.com/"/>
+    <ds:schemaRef ds:uri="http://schemas.microsoft.com/office/2006/metadata/contentType"/>
+    <ds:schemaRef ds:uri="http://schemas.microsoft.com/office/2006/metadata/properties/metaAttributes"/>
+    <ds:schemaRef ds:uri="http://www.w3.org/2001/XMLSchema"/>
+    <ds:schemaRef ds:uri="http://schemas.microsoft.com/office/2006/metadata/properties"/>
+    <ds:schemaRef ds:uri="http://schemas.openxmlformats.org/package/2006/metadata/core-properties"/>
+    <ds:schemaRef ds:uri="http://purl.org/dc/elements/1.1/"/>
+    <ds:schemaRef ds:uri="http://purl.org/dc/terms/"/>
+    <ds:schemaRef ds:uri="http://schemas.microsoft.com/internal/obd"/>
+    <ds:schemaRef ds:uri="http://schemas.microsoft.com/office/infopath/2007/PartnerControls"/>
   </ds:schemaRefs>
 </ds:datastoreItem>
 </file>
@@ -5900,17 +7011,10 @@
 </file>
 
 <file path=customXml/itemProps4.xml><?xml version="1.0" encoding="utf-8"?>
-<ds:datastoreItem xmlns:ds="http://schemas.openxmlformats.org/officeDocument/2006/customXml" ds:itemID="{0B67D417-F46B-459B-BE4A-CE060E0409B1}">
+<ds:datastoreItem xmlns:ds="http://schemas.openxmlformats.org/officeDocument/2006/customXml" ds:itemID="{11111111-1234-1234-1234-123412341234}">
   <ds:schemaRefs>
-    <ds:schemaRef ds:uri="http://schemas.microsoft.com/office/2006/metadata/contentType"/>
-    <ds:schemaRef ds:uri="http://schemas.microsoft.com/office/2006/metadata/properties/metaAttributes"/>
-    <ds:schemaRef ds:uri="http://www.w3.org/2001/XMLSchema"/>
-    <ds:schemaRef ds:uri="http://schemas.microsoft.com/office/2006/metadata/properties"/>
-    <ds:schemaRef ds:uri="http://schemas.openxmlformats.org/package/2006/metadata/core-properties"/>
-    <ds:schemaRef ds:uri="http://purl.org/dc/elements/1.1/"/>
-    <ds:schemaRef ds:uri="http://purl.org/dc/terms/"/>
-    <ds:schemaRef ds:uri="http://schemas.microsoft.com/internal/obd"/>
-    <ds:schemaRef ds:uri="http://schemas.microsoft.com/office/infopath/2007/PartnerControls"/>
+    <ds:schemaRef ds:uri="http://schemas.openxmlformats.org/officeDocument/2006/relationships"/>
+    <ds:schemaRef ds:uri="http://customooxmlschemas.google.com/"/>
   </ds:schemaRefs>
 </ds:datastoreItem>
 </file>
</xml_diff>